<commit_message>
changes to the report
</commit_message>
<xml_diff>
--- a/Final_Report.docx
+++ b/Final_Report.docx
@@ -2,9 +2,10 @@
 <file path=word/document.xml><?xml version="1.0" encoding="utf-8"?>
 <w:document xmlns:w="http://schemas.openxmlformats.org/wordprocessingml/2006/main" xmlns:m="http://schemas.openxmlformats.org/officeDocument/2006/math" xmlns:r="http://schemas.openxmlformats.org/officeDocument/2006/relationships" xmlns:o="urn:schemas-microsoft-com:office:office" xmlns:v="urn:schemas-microsoft-com:vml" xmlns:w10="urn:schemas-microsoft-com:office:word" xmlns:a="http://schemas.openxmlformats.org/drawingml/2006/main" xmlns:pic="http://schemas.openxmlformats.org/drawingml/2006/picture" xmlns:wp="http://schemas.openxmlformats.org/drawingml/2006/wordprocessingDrawing">
   <w:body>
-    <w:p>
-      <w:pPr>
-        <w:pStyle w:val="Title"/>
+    <w:bookmarkStart w:id="47" w:name="X1f7847967cc4fba3291e2e37cd06f9f0777aa0f"/>
+    <w:p>
+      <w:pPr>
+        <w:pStyle w:val="Heading1"/>
       </w:pPr>
       <w:r>
         <w:t xml:space="preserve">NFL Game Outcome and Point Spread Prediction Using Ensemble Machine Learning</w:t>
@@ -12,23 +13,27 @@
     </w:p>
     <w:p>
       <w:pPr>
-        <w:pStyle w:val="Author"/>
-      </w:pPr>
-      <w:r>
+        <w:pStyle w:val="FirstParagraph"/>
+      </w:pPr>
+      <w:r>
+        <w:rPr>
+          <w:b/>
+          <w:bCs/>
+        </w:rPr>
         <w:t xml:space="preserve">Akul Aggarwal</w:t>
       </w:r>
-    </w:p>
-    <w:p>
-      <w:pPr>
-        <w:pStyle w:val="Date"/>
-      </w:pPr>
-      <w:r>
-        <w:t xml:space="preserve">CS5100 — Foundations of Artificial Intelligence · August 2026</w:t>
-      </w:r>
-    </w:p>
-    <w:p>
-      <w:r>
-        <w:br w:type="page"/>
+      <w:r>
+        <w:t xml:space="preserve"> </w:t>
+      </w:r>
+      <w:r>
+        <w:t xml:space="preserve">· CS5100 — Foundations of Artificial Intelligence · August 2026</w:t>
+      </w:r>
+    </w:p>
+    <w:p>
+      <w:r>
+        <w:pict>
+          <v:rect style="width:0;height:1.5pt" o:hralign="center" o:hrstd="t" o:hr="t"/>
+        </w:pict>
       </w:r>
     </w:p>
     <w:bookmarkStart w:id="11" w:name="introduction"/>
@@ -54,7 +59,7 @@
         <w:pStyle w:val="FirstParagraph"/>
       </w:pPr>
       <w:r>
-        <w:t xml:space="preserve">This project builds a machine learning system that predicts the winner and point spread of National Football League (NFL) games before they are played, using only information available prior to kickoff (team statistics, schedule context, and market data through the prior week). The task is framed as two coupled prediction problems: a binary classification problem (which team wins) and a regression problem (by how many points). Predictions are generated and evaluated week-by-week across a full NFL season, allowing the system to be judged not on a single static test set but on 22 weeks of genuinely out-of-sample, sequential forecasts.</w:t>
+        <w:t xml:space="preserve">This project builds a machine learning system that predicts NFL game winners and point spreads before kickoff, using only information available beforehand (team statistics, schedule context, and market data through the prior week). It is framed as two coupled problems — binary classification (which team wins) and regression (by how many points) — generated and graded week-by-week across a full season, so the system is judged on 22 weeks of genuinely out-of-sample forecasts rather than one static test set.</w:t>
       </w:r>
     </w:p>
     <w:bookmarkEnd w:id="9"/>
@@ -72,7 +77,7 @@
         <w:pStyle w:val="FirstParagraph"/>
       </w:pPr>
       <w:r>
-        <w:t xml:space="preserve">Predicting the outcome of professional sports games sits at an interesting intersection of applied machine learning and market efficiency research. Unlike many benchmark ML problems, sports outcomes are governed by a market — the sports betting line — that already aggregates a large amount of public information and expert opinion into a single number. This makes NFL prediction a meaningful test of whether a statistically-driven model can extract</w:t>
+        <w:t xml:space="preserve">Predicting sports outcomes sits at an interesting intersection of applied ML and market-efficiency research: sports betting lines already aggregate large amounts of public information into a single number, making NFL prediction a meaningful test of whether a model can extract</w:t>
       </w:r>
       <w:r>
         <w:t xml:space="preserve"> </w:t>
@@ -88,15 +93,7 @@
         <w:t xml:space="preserve"> </w:t>
       </w:r>
       <w:r>
-        <w:t xml:space="preserve">signal beyond what oddsmakers already price in, or whether it simply re-derives the same conclusion the market already reached.</w:t>
-      </w:r>
-    </w:p>
-    <w:p>
-      <w:pPr>
-        <w:pStyle w:val="BodyText"/>
-      </w:pPr>
-      <w:r>
-        <w:t xml:space="preserve">The literature on market efficiency in NFL point spreads is directly relevant here. Both Spinosa (2018) and Fohey similarly test the efficiency of the NFL point-spread betting market and find that, while the market is largely efficient, small and inconsistent inefficiencies exist that are difficult to exploit systematically — which sets a realistic expectation for how much a predictive model can be expected to outperform the market rather than simply match it. Nate Silver’s</w:t>
+        <w:t xml:space="preserve">signal beyond what oddsmakers already price in. Spinosa (2018) and Fohey both find the NFL point-spread market largely efficient, with only small, hard-to-exploit inefficiencies — a realistic ceiling on how much a model should be expected to beat the market rather than just match it. Nate Silver’s</w:t>
       </w:r>
       <w:r>
         <w:t xml:space="preserve"> </w:t>
@@ -112,7 +109,7 @@
         <w:t xml:space="preserve"> </w:t>
       </w:r>
       <w:r>
-        <w:t xml:space="preserve">(2012) frames this more broadly: sports forecasting is a useful public laboratory for studying prediction under uncertainty precisely because outcomes are observed quickly and outcomes are graded objectively, unlike many other domains where</w:t>
+        <w:t xml:space="preserve">(2012) frames sports forecasting more broadly as a useful laboratory for prediction under uncertainty, since outcomes are observed and graded quickly and objectively, unlike domains where</w:t>
       </w:r>
       <w:r>
         <w:t xml:space="preserve"> </w:t>
@@ -124,7 +121,7 @@
         <w:t xml:space="preserve"> </w:t>
       </w:r>
       <w:r>
-        <w:t xml:space="preserve">arrives slowly or ambiguously.</w:t>
+        <w:t xml:space="preserve">arrives slowly.</w:t>
       </w:r>
     </w:p>
     <w:p>
@@ -132,23 +129,7 @@
         <w:pStyle w:val="BodyText"/>
       </w:pPr>
       <w:r>
-        <w:t xml:space="preserve">Beyond the research angle, the practical stakes are real: the global sports betting industry is estimated in the tens of billions of dollars annually, fantasy football involves tens of millions of participants, and NFL front offices increasingly invest in analytics departments for personnel and game-planning decisions. A system that can produce well-calibrated probability estimates — not just a winner pick, but a</w:t>
-      </w:r>
-      <w:r>
-        <w:t xml:space="preserve"> </w:t>
-      </w:r>
-      <w:r>
-        <w:rPr>
-          <w:i/>
-          <w:iCs/>
-        </w:rPr>
-        <w:t xml:space="preserve">trustworthy confidence level</w:t>
-      </w:r>
-      <w:r>
-        <w:t xml:space="preserve"> </w:t>
-      </w:r>
-      <w:r>
-        <w:t xml:space="preserve">— has direct value across all three use cases.</w:t>
+        <w:t xml:space="preserve">The practical stakes are real: sports betting is a tens-of-billions-dollar industry, fantasy football involves tens of millions of participants, and NFL front offices increasingly invest in analytics. A system producing well-calibrated probabilities — not just a pick, but a trustworthy confidence level — has value across all three.</w:t>
       </w:r>
     </w:p>
     <w:p>
@@ -168,7 +149,7 @@
         </w:numPr>
       </w:pPr>
       <w:r>
-        <w:t xml:space="preserve">Build an end-to-end ML pipeline covering data collection, feature engineering, model training, and weekly deployment.</w:t>
+        <w:t xml:space="preserve">Build an end-to-end ML pipeline from data collection through weekly deployment.</w:t>
       </w:r>
     </w:p>
     <w:p>
@@ -180,7 +161,7 @@
         </w:numPr>
       </w:pPr>
       <w:r>
-        <w:t xml:space="preserve">Produce calibrated win probabilities rather than raw classifier outputs, so that confidence levels are actionable.</w:t>
+        <w:t xml:space="preserve">Produce calibrated win probabilities, not raw classifier outputs.</w:t>
       </w:r>
     </w:p>
     <w:p>
@@ -192,7 +173,7 @@
         </w:numPr>
       </w:pPr>
       <w:r>
-        <w:t xml:space="preserve">Evaluate the model honestly across a full season of genuinely prospective (not retrospectively cherry-picked) predictions.</w:t>
+        <w:t xml:space="preserve">Evaluate honestly on a full season of genuinely prospective, not retrospectively cherry-picked, predictions.</w:t>
       </w:r>
     </w:p>
     <w:p>
@@ -216,7 +197,7 @@
         </w:numPr>
       </w:pPr>
       <w:r>
-        <w:t xml:space="preserve">Critically assess where a mid-season architecture change helped or hurt performance — treating this as a controlled natural experiment within the project itself.</w:t>
+        <w:t xml:space="preserve">Treat a mid-season architecture change as a natural experiment in whether added complexity helps.</w:t>
       </w:r>
     </w:p>
     <w:p>
@@ -251,7 +232,7 @@
         <w:pStyle w:val="FirstParagraph"/>
       </w:pPr>
       <w:r>
-        <w:t xml:space="preserve">Machine learning approaches to NFL outcome prediction have a reasonably long history in the applied ML literature. Hamadani’s early Stanford CS229 project applied standard classifiers to NFL game outcomes and established that simple box-score-derived features could beat a 50% baseline by a meaningful margin, though not dramatically. Beal, Norman, and Ramchurn (2020) conducted a more rigorous and recent comparison, testing nine different machine learning classifiers on five seasons of NFL games (1,280 games, 42 engineered features) and benchmarking their accuracy directly against bookmaker point spreads — a methodology this project mirrors by comparing predicted spreads against the model’s own confidence-implied edge. Their finding that no single classifier dominates, and that ensembling multiple models narrows the gap to the market, directly motivated the choice of a multi-model ensemble (Random Forest, Logistic Regression, Gradient Boosting, and XGBoost) rather than a single best-in-class algorithm in this project.</w:t>
+        <w:t xml:space="preserve">NFL outcome prediction has a reasonable history in applied ML. Hamadani’s Stanford CS229 project showed simple box-score features beat a 50% baseline. Beal, Norman, and Ramchurn (2020) tested nine classifiers on five seasons (1,280 games, 42 features) against bookmaker spreads and found no single classifier dominates, but ensembling narrows the gap to the market — directly motivating this project’s multi-model ensemble (Random Forest, Logistic Regression, Gradient Boosting, XGBoost) over a single algorithm. Broader systematic reviews (arXiv:1912.11762, arXiv:2410.21484) confirm the feature categories used here — offensive/defensive efficiency, momentum, and contextual factors — are standard across sports prediction, and Fernandes et al. (2020) show interpretable, feature-engineered models remain competitive (75.3% accuracy on NFL play prediction) even as deep learning has grown more common in the field.</w:t>
       </w:r>
     </w:p>
     <w:p>
@@ -259,47 +240,7 @@
         <w:pStyle w:val="BodyText"/>
       </w:pPr>
       <w:r>
-        <w:t xml:space="preserve">Related work on team-sport prediction more broadly (a 2019 systematic review, arXiv:1912.11762, and a more recent 2024 systematic review of machine learning in sports betting, arXiv:2410.21484) surveys the feature categories most commonly used across sports — offensive/defensive efficiency metrics, recent-form or momentum indicators, and contextual factors like rest and home advantage — which maps closely onto the feature families engineered in this project (Section 3.2). Fernandes et al. (2020) additionally show that interpretable, feature-engineered models can achieve strong accuracy (75.3%) on the related task of NFL</w:t>
-      </w:r>
-      <w:r>
-        <w:t xml:space="preserve"> </w:t>
-      </w:r>
-      <w:r>
-        <w:rPr>
-          <w:i/>
-          <w:iCs/>
-        </w:rPr>
-        <w:t xml:space="preserve">play</w:t>
-      </w:r>
-      <w:r>
-        <w:t xml:space="preserve"> </w:t>
-      </w:r>
-      <w:r>
-        <w:t xml:space="preserve">prediction, reinforcing that hand-engineered football-domain features remain competitive with more opaque approaches even as deep learning has become more common in sports analytics.</w:t>
-      </w:r>
-    </w:p>
-    <w:p>
-      <w:pPr>
-        <w:pStyle w:val="BodyText"/>
-      </w:pPr>
-      <w:r>
-        <w:t xml:space="preserve">The calibration side of this project is informed by Wunderlich and colleagues (University of Bath, arXiv:2303.06021), who show that machine learning models for sports betting optimized purely for classification accuracy can perform far worse in practice (in terms of realized betting return) than models explicitly optimized for probability</w:t>
-      </w:r>
-      <w:r>
-        <w:t xml:space="preserve"> </w:t>
-      </w:r>
-      <w:r>
-        <w:rPr>
-          <w:i/>
-          <w:iCs/>
-        </w:rPr>
-        <w:t xml:space="preserve">calibration</w:t>
-      </w:r>
-      <w:r>
-        <w:t xml:space="preserve"> </w:t>
-      </w:r>
-      <w:r>
-        <w:t xml:space="preserve">— in their study, a calibration-optimized approach achieved a 110% return versus 3% for an accuracy-optimized one under otherwise similar conditions. This finding is the primary justification for wrapping every classifier in this project’s ensemble in</w:t>
+        <w:t xml:space="preserve">The calibration focus is informed by Wunderlich et al. (University of Bath, arXiv:2303.06021), who show sports-betting models optimized for accuracy alone can perform far worse in realized return than calibration-optimized ones (110% vs. 3% return in their study) — the primary justification for wrapping every classifier here in</w:t>
       </w:r>
       <w:r>
         <w:t xml:space="preserve"> </w:t>
@@ -314,7 +255,7 @@
         <w:t xml:space="preserve"> </w:t>
       </w:r>
       <w:r>
-        <w:t xml:space="preserve">with isotonic regression, rather than relying on raw predicted probabilities.</w:t>
+        <w:t xml:space="preserve">(isotonic regression) rather than using raw predicted probabilities.</w:t>
       </w:r>
     </w:p>
     <w:bookmarkEnd w:id="12"/>
@@ -325,14 +266,6 @@
       </w:pPr>
       <w:r>
         <w:t xml:space="preserve">2.2 AI/ML Concepts Used</w:t>
-      </w:r>
-    </w:p>
-    <w:p>
-      <w:pPr>
-        <w:pStyle w:val="FirstParagraph"/>
-      </w:pPr>
-      <w:r>
-        <w:t xml:space="preserve">This project draws on several core machine learning concepts covered in the course:</w:t>
       </w:r>
     </w:p>
     <w:p>
@@ -351,7 +284,7 @@
         <w:t xml:space="preserve">Ensemble learning</w:t>
       </w:r>
       <w:r>
-        <w:t xml:space="preserve">: combining heterogeneous base learners (tree-based and linear models) via soft voting to reduce variance relative to any single model.</w:t>
+        <w:t xml:space="preserve">: heterogeneous base learners combined via soft voting to reduce variance relative to any single model.</w:t>
       </w:r>
     </w:p>
     <w:p>
@@ -370,7 +303,7 @@
         <w:t xml:space="preserve">Probability calibration</w:t>
       </w:r>
       <w:r>
-        <w:t xml:space="preserve">: post-hoc adjustment (isotonic regression) of classifier outputs so that a predicted</w:t>
+        <w:t xml:space="preserve">: isotonic regression so a</w:t>
       </w:r>
       <w:r>
         <w:t xml:space="preserve"> </w:t>
@@ -382,7 +315,7 @@
         <w:t xml:space="preserve"> </w:t>
       </w:r>
       <w:r>
-        <w:t xml:space="preserve">genuinely corresponds to a ~70% empirical win rate.</w:t>
+        <w:t xml:space="preserve">prediction reflects a real ~70% empirical win rate.</w:t>
       </w:r>
     </w:p>
     <w:p>
@@ -398,10 +331,10 @@
           <w:b/>
           <w:bCs/>
         </w:rPr>
-        <w:t xml:space="preserve">Regularization and overfitting control</w:t>
-      </w:r>
-      <w:r>
-        <w:t xml:space="preserve">: L1/L2 penalties, tree depth limits, and subsampling to prevent the ensemble from memorizing noise in a small-sample, high-variance domain.</w:t>
+        <w:t xml:space="preserve">Regularization</w:t>
+      </w:r>
+      <w:r>
+        <w:t xml:space="preserve">: L1/L2 penalties, tree depth limits, and subsampling to control overfitting in a small, high-variance domain.</w:t>
       </w:r>
     </w:p>
     <w:p>
@@ -435,7 +368,7 @@
         <w:t xml:space="preserve"> </w:t>
       </w:r>
       <w:r>
-        <w:t xml:space="preserve">cross-validation, which respects temporal order and prevents the model from being evaluated on data that would not have existed at prediction time (a data-leakage failure mode that is easy to introduce accidentally with a naive random train/test split).</w:t>
+        <w:t xml:space="preserve">CV, preventing leakage of future information into training.</w:t>
       </w:r>
     </w:p>
     <w:p>
@@ -454,7 +387,7 @@
         <w:t xml:space="preserve">Feature selection</w:t>
       </w:r>
       <w:r>
-        <w:t xml:space="preserve">: Recursive Feature Elimination (RFE) to reduce an initial pool of 30+ engineered features down to a smaller, more robust set less prone to overfitting.</w:t>
+        <w:t xml:space="preserve">: Recursive Feature Elimination (RFE) reduces 30+ candidate features to a smaller, more robust set.</w:t>
       </w:r>
     </w:p>
     <w:p>
@@ -470,10 +403,10 @@
           <w:b/>
           <w:bCs/>
         </w:rPr>
-        <w:t xml:space="preserve">Regression under skewed/heavy-tailed error</w:t>
-      </w:r>
-      <w:r>
-        <w:t xml:space="preserve">: quantile-loss Gradient Boosting for point-spread prediction, chosen because spread errors are not symmetric or Gaussian in practice (blowouts create long tails).</w:t>
+        <w:t xml:space="preserve">Skewed-error regression</w:t>
+      </w:r>
+      <w:r>
+        <w:t xml:space="preserve">: quantile-loss Gradient Boosting for point spreads, since blowouts create long-tailed errors.</w:t>
       </w:r>
     </w:p>
     <w:p>
@@ -508,7 +441,7 @@
         <w:pStyle w:val="FirstParagraph"/>
       </w:pPr>
       <w:r>
-        <w:t xml:space="preserve">The system is implemented in Python using Jupyter notebooks. Core libraries:</w:t>
+        <w:t xml:space="preserve">Implemented in Python/Jupyter. Core libraries:</w:t>
       </w:r>
       <w:r>
         <w:t xml:space="preserve"> </w:t>
@@ -520,13 +453,7 @@
         <w:t xml:space="preserve">pandas</w:t>
       </w:r>
       <w:r>
-        <w:t xml:space="preserve"> </w:t>
-      </w:r>
-      <w:r>
-        <w:t xml:space="preserve">and</w:t>
-      </w:r>
-      <w:r>
-        <w:t xml:space="preserve"> </w:t>
+        <w:t xml:space="preserve">/</w:t>
       </w:r>
       <w:r>
         <w:rPr>
@@ -535,10 +462,7 @@
         <w:t xml:space="preserve">numpy</w:t>
       </w:r>
       <w:r>
-        <w:t xml:space="preserve"> </w:t>
-      </w:r>
-      <w:r>
-        <w:t xml:space="preserve">for data manipulation,</w:t>
+        <w:t xml:space="preserve">,</w:t>
       </w:r>
       <w:r>
         <w:t xml:space="preserve"> </w:t>
@@ -553,7 +477,7 @@
         <w:t xml:space="preserve"> </w:t>
       </w:r>
       <w:r>
-        <w:t xml:space="preserve">for the ensemble classifiers, calibration, RFE, and cross-validation utilities,</w:t>
+        <w:t xml:space="preserve">(ensembles, calibration, RFE, cross-validation),</w:t>
       </w:r>
       <w:r>
         <w:t xml:space="preserve"> </w:t>
@@ -565,10 +489,7 @@
         <w:t xml:space="preserve">xgboost</w:t>
       </w:r>
       <w:r>
-        <w:t xml:space="preserve"> </w:t>
-      </w:r>
-      <w:r>
-        <w:t xml:space="preserve">for gradient-boosted trees,</w:t>
+        <w:t xml:space="preserve">,</w:t>
       </w:r>
       <w:r>
         <w:t xml:space="preserve"> </w:t>
@@ -589,10 +510,7 @@
         <w:t xml:space="preserve">seaborn</w:t>
       </w:r>
       <w:r>
-        <w:t xml:space="preserve"> </w:t>
-      </w:r>
-      <w:r>
-        <w:t xml:space="preserve">for visualization, and</w:t>
+        <w:t xml:space="preserve">,</w:t>
       </w:r>
       <w:r>
         <w:t xml:space="preserve"> </w:t>
@@ -604,10 +522,7 @@
         <w:t xml:space="preserve">joblib</w:t>
       </w:r>
       <w:r>
-        <w:t xml:space="preserve"> </w:t>
-      </w:r>
-      <w:r>
-        <w:t xml:space="preserve">for model persistence. All NFL statistics are sourced programmatically through the</w:t>
+        <w:t xml:space="preserve">. All NFL data comes from</w:t>
       </w:r>
       <w:r>
         <w:t xml:space="preserve"> </w:t>
@@ -622,7 +537,7 @@
         <w:t xml:space="preserve"> </w:t>
       </w:r>
       <w:r>
-        <w:t xml:space="preserve">library (https://github.com/cooperdff/nfl_data_py), which wraps official NFL data feeds.</w:t>
+        <w:t xml:space="preserve">(https://github.com/cooperdff/nfl_data_py).</w:t>
       </w:r>
     </w:p>
     <w:p>
@@ -634,32 +549,22 @@
           <w:b/>
           <w:bCs/>
         </w:rPr>
-        <w:t xml:space="preserve">Setup instructions:</w:t>
-      </w:r>
-    </w:p>
-    <w:p>
-      <w:pPr>
-        <w:pStyle w:val="SourceCode"/>
-      </w:pPr>
-      <w:r>
-        <w:rPr>
-          <w:rStyle w:val="ExtensionTok"/>
-        </w:rPr>
-        <w:t xml:space="preserve">pip</w:t>
-      </w:r>
-      <w:r>
-        <w:rPr>
-          <w:rStyle w:val="NormalTok"/>
-        </w:rPr>
-        <w:t xml:space="preserve"> install pandas numpy scikit-learn xgboost nfl_data_py joblib matplotlib seaborn pillow</w:t>
-      </w:r>
-    </w:p>
-    <w:p>
-      <w:pPr>
-        <w:pStyle w:val="FirstParagraph"/>
-      </w:pPr>
-      <w:r>
-        <w:t xml:space="preserve">Each week’s prediction notebook (</w:t>
+        <w:t xml:space="preserve">Setup:</w:t>
+      </w:r>
+      <w:r>
+        <w:t xml:space="preserve"> </w:t>
+      </w:r>
+      <w:r>
+        <w:rPr>
+          <w:rStyle w:val="VerbatimChar"/>
+        </w:rPr>
+        <w:t xml:space="preserve">pip install -r requirements.txt</w:t>
+      </w:r>
+      <w:r>
+        <w:t xml:space="preserve">. Each</w:t>
+      </w:r>
+      <w:r>
+        <w:t xml:space="preserve"> </w:t>
       </w:r>
       <w:r>
         <w:rPr>
@@ -668,7 +573,10 @@
         <w:t xml:space="preserve">Week{N}/Model.ipynb</w:t>
       </w:r>
       <w:r>
-        <w:t xml:space="preserve">) is self-contained and can be run top-to-bottom in Jupyter; the first run downloads and caches ~5 seasons of NFL data locally (5-15 minutes), after which cached data reduces this to 3-5 minutes.</w:t>
+        <w:t xml:space="preserve"> </w:t>
+      </w:r>
+      <w:r>
+        <w:t xml:space="preserve">is self-contained and runs top-to-bottom; the first run per week downloads and caches data (5–15 min), later runs reuse the cache (3–5 min).</w:t>
       </w:r>
       <w:r>
         <w:t xml:space="preserve"> </w:t>
@@ -683,37 +591,7 @@
         <w:t xml:space="preserve"> </w:t>
       </w:r>
       <w:r>
-        <w:t xml:space="preserve">in the repository root aggregates saved predictions from every week’s</w:t>
-      </w:r>
-      <w:r>
-        <w:t xml:space="preserve"> </w:t>
-      </w:r>
-      <w:r>
-        <w:rPr>
-          <w:rStyle w:val="VerbatimChar"/>
-        </w:rPr>
-        <w:t xml:space="preserve">week{N}_predictions.csv</w:t>
-      </w:r>
-      <w:r>
-        <w:t xml:space="preserve"> </w:t>
-      </w:r>
-      <w:r>
-        <w:t xml:space="preserve">file and fetches actual results via</w:t>
-      </w:r>
-      <w:r>
-        <w:t xml:space="preserve"> </w:t>
-      </w:r>
-      <w:r>
-        <w:rPr>
-          <w:rStyle w:val="VerbatimChar"/>
-        </w:rPr>
-        <w:t xml:space="preserve">nfl_data_py</w:t>
-      </w:r>
-      <w:r>
-        <w:t xml:space="preserve"> </w:t>
-      </w:r>
-      <w:r>
-        <w:t xml:space="preserve">to compute accuracy statistics and generate the visualizations used in Section 4.</w:t>
+        <w:t xml:space="preserve">aggregates every week’s saved predictions against actual results into the visualizations used in Section 4.</w:t>
       </w:r>
     </w:p>
     <w:p>
@@ -725,10 +603,13 @@
           <w:b/>
           <w:bCs/>
         </w:rPr>
-        <w:t xml:space="preserve">On folder structure</w:t>
-      </w:r>
-      <w:r>
-        <w:t xml:space="preserve">: this repository is organized by NFL week (</w:t>
+        <w:t xml:space="preserve">Folder structure:</w:t>
+      </w:r>
+      <w:r>
+        <w:t xml:space="preserve"> </w:t>
+      </w:r>
+      <w:r>
+        <w:t xml:space="preserve">organized by week (</w:t>
       </w:r>
       <w:r>
         <w:rPr>
@@ -737,13 +618,7 @@
         <w:t xml:space="preserve">Week1/</w:t>
       </w:r>
       <w:r>
-        <w:t xml:space="preserve"> </w:t>
-      </w:r>
-      <w:r>
-        <w:t xml:space="preserve">through</w:t>
-      </w:r>
-      <w:r>
-        <w:t xml:space="preserve"> </w:t>
+        <w:t xml:space="preserve">–</w:t>
       </w:r>
       <w:r>
         <w:rPr>
@@ -785,7 +660,7 @@
         <w:t xml:space="preserve">scripts/</w:t>
       </w:r>
       <w:r>
-        <w:t xml:space="preserve">). This structure was a deliberate fit for the project’s actual workflow: because the model retrains from scratch and is redeployed every week of a live season, each week is a self-contained unit containing its own notebook, cached data, trained model checkpoint, and output predictions — mirroring how the project was actually run in production over 22 weeks rather than as a single offline experiment.</w:t>
+        <w:t xml:space="preserve">), since the model retrains and redeploys every week of a live season — each week is a self-contained production unit, not a single offline experiment.</w:t>
       </w:r>
     </w:p>
     <w:bookmarkEnd w:id="15"/>
@@ -803,7 +678,7 @@
         <w:pStyle w:val="FirstParagraph"/>
       </w:pPr>
       <w:r>
-        <w:t xml:space="preserve">All data is sourced from</w:t>
+        <w:t xml:space="preserve">Data comes from</w:t>
       </w:r>
       <w:r>
         <w:t xml:space="preserve"> </w:t>
@@ -815,22 +690,7 @@
         <w:t xml:space="preserve">nfl_data_py</w:t>
       </w:r>
       <w:r>
-        <w:t xml:space="preserve">, which provides three data types used in this project: play-by-play data (game-level statistics, 2015–2025), weekly player-level statistics, and full schedule/results data. Data is cached locally as CSV files inside per-week</w:t>
-      </w:r>
-      <w:r>
-        <w:t xml:space="preserve"> </w:t>
-      </w:r>
-      <w:r>
-        <w:rPr>
-          <w:rStyle w:val="VerbatimChar"/>
-        </w:rPr>
-        <w:t xml:space="preserve">nfl_data/</w:t>
-      </w:r>
-      <w:r>
-        <w:t xml:space="preserve"> </w:t>
-      </w:r>
-      <w:r>
-        <w:t xml:space="preserve">folders to avoid re-downloading on every run.</w:t>
+        <w:t xml:space="preserve">: play-by-play (2015–2025), weekly player statistics, and schedule/results, cached locally per week.</w:t>
       </w:r>
     </w:p>
     <w:p>
@@ -838,204 +698,93 @@
         <w:pStyle w:val="BodyText"/>
       </w:pPr>
       <w:r>
-        <w:t xml:space="preserve">Preprocessing steps applied before model training:</w:t>
-      </w:r>
-      <w:r>
-        <w:t xml:space="preserve"> </w:t>
-      </w:r>
-      <w:r>
-        <w:t xml:space="preserve">1.</w:t>
-      </w:r>
-      <w:r>
-        <w:t xml:space="preserve"> </w:t>
-      </w:r>
+        <w:t xml:space="preserve">Preprocessing: (1) player stats summed to team-level per-game totals, then averaged season-to-date; (2) temporal filtering — only weeks</w:t>
+      </w:r>
+      <w:r>
+        <w:t xml:space="preserve"> </w:t>
+      </w:r>
+      <w:r>
+        <w:rPr>
+          <w:i/>
+          <w:iCs/>
+        </w:rPr>
+        <w:t xml:space="preserve">before</w:t>
+      </w:r>
+      <w:r>
+        <w:t xml:space="preserve"> </w:t>
+      </w:r>
+      <w:r>
+        <w:t xml:space="preserve">the target week are used, preventing leakage; (3) mean imputation for missing values; (4) team abbreviations standardized (e.g., Rams as</w:t>
+      </w:r>
+      <w:r>
+        <w:t xml:space="preserve"> </w:t>
+      </w:r>
+      <w:r>
+        <w:rPr>
+          <w:rStyle w:val="VerbatimChar"/>
+        </w:rPr>
+        <w:t xml:space="preserve">LA</w:t>
+      </w:r>
+      <w:r>
+        <w:t xml:space="preserve">, not</w:t>
+      </w:r>
+      <w:r>
+        <w:t xml:space="preserve"> </w:t>
+      </w:r>
+      <w:r>
+        <w:rPr>
+          <w:rStyle w:val="VerbatimChar"/>
+        </w:rPr>
+        <w:t xml:space="preserve">LAR</w:t>
+      </w:r>
+      <w:r>
+        <w:t xml:space="preserve">).</w:t>
+      </w:r>
+    </w:p>
+    <w:p>
+      <w:pPr>
+        <w:pStyle w:val="BodyText"/>
+      </w:pPr>
       <w:r>
         <w:rPr>
           <w:b/>
           <w:bCs/>
         </w:rPr>
-        <w:t xml:space="preserve">Aggregation</w:t>
-      </w:r>
-      <w:r>
-        <w:t xml:space="preserve">: player-level weekly statistics are summed to team-level per-game totals (e.g., total team passing yards for a given week), then averaged across the season-to-date to produce per-game rate features.</w:t>
-      </w:r>
-      <w:r>
-        <w:t xml:space="preserve"> </w:t>
-      </w:r>
-      <w:r>
-        <w:t xml:space="preserve">2.</w:t>
-      </w:r>
-      <w:r>
-        <w:t xml:space="preserve"> </w:t>
-      </w:r>
+        <w:t xml:space="preserve">Feature engineering</w:t>
+      </w:r>
+      <w:r>
+        <w:t xml:space="preserve"> </w:t>
+      </w:r>
+      <w:r>
+        <w:t xml:space="preserve">produced roughly 30 candidate features: offensive/defensive per-game stats, turnovers, home-field advantage (+2.5 pts), playoff/week indicators, and — from Week 10 — momentum, estimated injury impact, rest days, division rivalry, and market spread. RFE reduced this pool to a cross-validated optimal subset (typically 7 features).</w:t>
+      </w:r>
+    </w:p>
+    <w:bookmarkEnd w:id="16"/>
+    <w:bookmarkStart w:id="20" w:name="model-architecture"/>
+    <w:p>
+      <w:pPr>
+        <w:pStyle w:val="Heading3"/>
+      </w:pPr>
+      <w:r>
+        <w:t xml:space="preserve">3.3 Model Architecture</w:t>
+      </w:r>
+    </w:p>
+    <w:p>
+      <w:pPr>
+        <w:pStyle w:val="FirstParagraph"/>
+      </w:pPr>
       <w:r>
         <w:rPr>
           <w:b/>
           <w:bCs/>
         </w:rPr>
-        <w:t xml:space="preserve">Temporal filtering to prevent leakage</w:t>
-      </w:r>
-      <w:r>
-        <w:t xml:space="preserve">: for any Week</w:t>
-      </w:r>
-      <w:r>
-        <w:t xml:space="preserve"> </w:t>
-      </w:r>
-      <w:r>
-        <w:rPr>
-          <w:i/>
-          <w:iCs/>
-        </w:rPr>
-        <w:t xml:space="preserve">N</w:t>
-      </w:r>
-      <w:r>
-        <w:t xml:space="preserve"> </w:t>
-      </w:r>
-      <w:r>
-        <w:t xml:space="preserve">prediction, only statistics from weeks</w:t>
-      </w:r>
-      <w:r>
-        <w:t xml:space="preserve"> </w:t>
-      </w:r>
-      <w:r>
-        <w:rPr>
-          <w:i/>
-          <w:iCs/>
-        </w:rPr>
-        <w:t xml:space="preserve">before</w:t>
-      </w:r>
-      <w:r>
-        <w:t xml:space="preserve"> </w:t>
-      </w:r>
-      <w:r>
-        <w:t xml:space="preserve">Week</w:t>
-      </w:r>
-      <w:r>
-        <w:t xml:space="preserve"> </w:t>
-      </w:r>
-      <w:r>
-        <w:rPr>
-          <w:i/>
-          <w:iCs/>
-        </w:rPr>
-        <w:t xml:space="preserve">N</w:t>
-      </w:r>
-      <w:r>
-        <w:t xml:space="preserve"> </w:t>
-      </w:r>
-      <w:r>
-        <w:t xml:space="preserve">are used — a team’s Week 8 passing average, for instance, never includes Week 8’s own game.</w:t>
-      </w:r>
-      <w:r>
-        <w:t xml:space="preserve"> </w:t>
-      </w:r>
-      <w:r>
-        <w:t xml:space="preserve">3.</w:t>
-      </w:r>
-      <w:r>
-        <w:t xml:space="preserve"> </w:t>
-      </w:r>
-      <w:r>
-        <w:rPr>
-          <w:b/>
-          <w:bCs/>
-        </w:rPr>
-        <w:t xml:space="preserve">Missing value handling</w:t>
-      </w:r>
-      <w:r>
-        <w:t xml:space="preserve">: mean imputation for numerical gaps (e.g., early-season teams with few games played).</w:t>
-      </w:r>
-      <w:r>
-        <w:t xml:space="preserve"> </w:t>
-      </w:r>
-      <w:r>
-        <w:t xml:space="preserve">4.</w:t>
-      </w:r>
-      <w:r>
-        <w:t xml:space="preserve"> </w:t>
-      </w:r>
-      <w:r>
-        <w:rPr>
-          <w:b/>
-          <w:bCs/>
-        </w:rPr>
-        <w:t xml:space="preserve">Standardization</w:t>
-      </w:r>
-      <w:r>
-        <w:t xml:space="preserve">: team abbreviations are normalized to the standard NFL 2–3 letter codes (with a manual mapping table for known inconsistencies, e.g., the Rams as</w:t>
-      </w:r>
-      <w:r>
-        <w:t xml:space="preserve"> </w:t>
-      </w:r>
-      <w:r>
-        <w:rPr>
-          <w:rStyle w:val="VerbatimChar"/>
-        </w:rPr>
-        <w:t xml:space="preserve">LA</w:t>
-      </w:r>
-      <w:r>
-        <w:t xml:space="preserve"> </w:t>
-      </w:r>
-      <w:r>
-        <w:t xml:space="preserve">rather than</w:t>
-      </w:r>
-      <w:r>
-        <w:t xml:space="preserve"> </w:t>
-      </w:r>
-      <w:r>
-        <w:rPr>
-          <w:rStyle w:val="VerbatimChar"/>
-        </w:rPr>
-        <w:t xml:space="preserve">LAR</w:t>
-      </w:r>
-      <w:r>
-        <w:t xml:space="preserve">).</w:t>
-      </w:r>
-    </w:p>
-    <w:p>
-      <w:pPr>
-        <w:pStyle w:val="BodyText"/>
-      </w:pPr>
-      <w:r>
-        <w:rPr>
-          <w:b/>
-          <w:bCs/>
-        </w:rPr>
-        <w:t xml:space="preserve">Feature engineering</w:t>
-      </w:r>
-      <w:r>
-        <w:t xml:space="preserve"> </w:t>
-      </w:r>
-      <w:r>
-        <w:t xml:space="preserve">produced roughly 30 candidate features across five categories: offensive (passing/rushing/total yards per game, points per game, touchdowns per game), defensive (opponent yards and points allowed per game), turnover metrics, contextual factors (home field advantage, fixed at +2.5 points; playoff indicator; week number), and — for Week 10 onward — an expanded set including momentum (win percentage over the last 3 games), estimated injury impact (derived from performance variance, not actual injury reports), rest days since the last game, a division-rivalry flag, and available market spread data. Recursive Feature Elimination was used to reduce this pool to a smaller, cross-validated optimal subset (typically 7 features) for the final classifier.</w:t>
-      </w:r>
-    </w:p>
-    <w:bookmarkEnd w:id="16"/>
-    <w:bookmarkStart w:id="20" w:name="model-architecture"/>
-    <w:p>
-      <w:pPr>
-        <w:pStyle w:val="Heading3"/>
-      </w:pPr>
-      <w:r>
-        <w:t xml:space="preserve">3.3 Model Architecture</w:t>
-      </w:r>
-    </w:p>
-    <w:p>
-      <w:pPr>
-        <w:pStyle w:val="FirstParagraph"/>
-      </w:pPr>
-      <w:r>
-        <w:rPr>
-          <w:b/>
-          <w:bCs/>
-        </w:rPr>
         <w:t xml:space="preserve">Winner classification</w:t>
       </w:r>
       <w:r>
         <w:t xml:space="preserve"> </w:t>
       </w:r>
       <w:r>
-        <w:t xml:space="preserve">uses a soft-voting ensemble. Two ensemble configurations were used across the season, which is itself a key point of comparison in this report (Section 5):</w:t>
+        <w:t xml:space="preserve">uses a soft-voting ensemble, in two configurations that are themselves a key comparison in this report (Section 5):</w:t>
       </w:r>
     </w:p>
     <w:p>
@@ -1065,10 +814,10 @@
           <w:b/>
           <w:bCs/>
         </w:rPr>
-        <w:t xml:space="preserve">) — 3-model ensemble</w:t>
-      </w:r>
-      <w:r>
-        <w:t xml:space="preserve">: Random Forest (200 trees, max depth 5), Logistic Regression (C=1), and XGBoost (max depth 5, learning rate 0.1).</w:t>
+        <w:t xml:space="preserve">)</w:t>
+      </w:r>
+      <w:r>
+        <w:t xml:space="preserve">: 3 models — Random Forest (200 trees, depth 5), Logistic Regression (C=1), XGBoost (depth 5, learning rate 0.1).</w:t>
       </w:r>
     </w:p>
     <w:p>
@@ -1098,22 +847,22 @@
           <w:b/>
           <w:bCs/>
         </w:rPr>
-        <w:t xml:space="preserve">) — 4-model ensemble with temporal weighting</w:t>
-      </w:r>
-      <w:r>
-        <w:t xml:space="preserve">: Random Forest (200 trees, max depth 15, with additional overfitting guards), Logistic Regression (C=1, max_iter=1000), Gradient Boosting Classifier (200 estimators, max depth 8), and XGBoost (max depth 8, L1/L2 regularization, 80% subsampling). Training samples are additionally weighted by season recency via exponential decay,</w:t>
-      </w:r>
-      <w:r>
-        <w:t xml:space="preserve"> </w:t>
-      </w:r>
-      <w:r>
-        <w:rPr>
-          <w:rStyle w:val="VerbatimChar"/>
-        </w:rPr>
-        <w:t xml:space="preserve">weight = exp(-0.15 × years_ago)</w:t>
-      </w:r>
-      <w:r>
-        <w:t xml:space="preserve">, so that 2024 data is weighted roughly 3× more heavily than 2015 data.</w:t>
+        <w:t xml:space="preserve">)</w:t>
+      </w:r>
+      <w:r>
+        <w:t xml:space="preserve">: 4 models with temporal weighting — Random Forest (200 trees, depth 15), Logistic Regression (C=1), Gradient Boosting (200 estimators, depth 8), XGBoost (depth 8, L1/L2 regularization, 80% subsampling). Samples weighted by recency:</w:t>
+      </w:r>
+      <w:r>
+        <w:t xml:space="preserve"> </w:t>
+      </w:r>
+      <w:r>
+        <w:rPr>
+          <w:rStyle w:val="VerbatimChar"/>
+        </w:rPr>
+        <w:t xml:space="preserve">exp(-0.15 × years_ago)</w:t>
+      </w:r>
+      <w:r>
+        <w:t xml:space="preserve">, so 2024 data counts roughly 3× more than 2015.</w:t>
       </w:r>
     </w:p>
     <w:p>
@@ -1121,7 +870,7 @@
         <w:pStyle w:val="FirstParagraph"/>
       </w:pPr>
       <w:r>
-        <w:t xml:space="preserve">In both configurations, every base classifier is wrapped in</w:t>
+        <w:t xml:space="preserve">Every base classifier in both configurations is wrapped in</w:t>
       </w:r>
       <w:r>
         <w:t xml:space="preserve"> </w:t>
@@ -1136,7 +885,7 @@
         <w:t xml:space="preserve"> </w:t>
       </w:r>
       <w:r>
-        <w:t xml:space="preserve">(isotonic regression, 3-fold CV) before being combined, consistent with the calibration-over-accuracy motivation discussed in Section 2.1.</w:t>
+        <w:t xml:space="preserve">(isotonic, 3-fold), per the calibration motivation in Section 2.1.</w:t>
       </w:r>
     </w:p>
     <w:p>
@@ -1146,9 +895,9 @@
       <w:r>
         <w:drawing>
           <wp:inline>
-            <wp:extent cx="5334000" cy="3151909"/>
+            <wp:extent cx="4533900" cy="2679122"/>
             <wp:effectExtent b="0" l="0" r="0" t="0"/>
-            <wp:docPr descr="End-to-end pipeline architecture (Weeks 14–22 layout). Four base classifiers are each individually calibrated before being combined by soft voting; a separate regression pipeline (right) predicts point spread." title="" id="18" name="Picture"/>
+            <wp:docPr descr="Pipeline architecture (Weeks 14–22 layout): four base classifiers each calibrated before soft-voting; a separate regression pipeline (right) predicts point spread." title="" id="18" name="Picture"/>
             <a:graphic>
               <a:graphicData uri="http://schemas.openxmlformats.org/drawingml/2006/picture">
                 <pic:pic>
@@ -1167,7 +916,7 @@
                   <pic:spPr bwMode="auto">
                     <a:xfrm>
                       <a:off x="0" y="0"/>
-                      <a:ext cx="5334000" cy="3151909"/>
+                      <a:ext cx="4533900" cy="2679122"/>
                     </a:xfrm>
                     <a:prstGeom prst="rect">
                       <a:avLst/>
@@ -1191,7 +940,7 @@
         <w:pStyle w:val="ImageCaption"/>
       </w:pPr>
       <w:r>
-        <w:t xml:space="preserve">End-to-end pipeline architecture (Weeks 14–22 layout). Four base classifiers are each individually calibrated before being combined by soft voting; a separate regression pipeline (right) predicts point spread.</w:t>
+        <w:t xml:space="preserve">Pipeline architecture (Weeks 14–22 layout): four base classifiers each calibrated before soft-voting; a separate regression pipeline (right) predicts point spread.</w:t>
       </w:r>
     </w:p>
     <w:p>
@@ -1209,7 +958,7 @@
         <w:t xml:space="preserve"> </w:t>
       </w:r>
       <w:r>
-        <w:t xml:space="preserve">(introduced Week 6) predicts the continuous point differential (home score − away score). Weeks 6–9 used a single Random Forest regressor. Weeks 10–22 test four candidate regression models per week — Random Forest, Linear Regression, quantile-loss Gradient Boosting, and regularized XGBoost — and automatically select whichever achieves the lowest mean absolute error (MAE) on validation folds that week.</w:t>
+        <w:t xml:space="preserve">(from Week 6) predicts the point differential. Weeks 6–9 used a single Random Forest regressor; Weeks 10–22 test four candidates (Random Forest, Linear, quantile-loss Gradient Boosting, regularized XGBoost) and keep whichever has the lowest validation MAE that week.</w:t>
       </w:r>
     </w:p>
     <w:bookmarkEnd w:id="20"/>
@@ -1227,7 +976,7 @@
         <w:pStyle w:val="FirstParagraph"/>
       </w:pPr>
       <w:r>
-        <w:t xml:space="preserve">Model evaluation used 5-fold</w:t>
+        <w:t xml:space="preserve">Evaluation used 5-fold</w:t>
       </w:r>
       <w:r>
         <w:t xml:space="preserve"> </w:t>
@@ -1242,7 +991,7 @@
         <w:t xml:space="preserve"> </w:t>
       </w:r>
       <w:r>
-        <w:t xml:space="preserve">cross-validation (training on an expanding earlier window, testing on the subsequent window) rather than random k-fold, specifically to avoid leaking future information into training — a well-known pitfall in any sequential/temporal prediction task. Tracked metrics included accuracy, Brier score (calibration quality), log loss, and AUC-ROC for the classifier, and MAE/RMSE for the spread regressor.</w:t>
+        <w:t xml:space="preserve">CV (expanding window) rather than random k-fold, to avoid leaking future data into training. Tracked metrics: accuracy, Brier score, log loss, AUC-ROC (classifier); MAE/RMSE (regressor).</w:t>
       </w:r>
     </w:p>
     <w:p>
@@ -1250,7 +999,7 @@
         <w:pStyle w:val="BodyText"/>
       </w:pPr>
       <w:r>
-        <w:t xml:space="preserve">Critically, beyond this internal cross-validation, every prediction reported in Section 4 was generated</w:t>
+        <w:t xml:space="preserve">Critically, every prediction in Section 4 was generated</w:t>
       </w:r>
       <w:r>
         <w:t xml:space="preserve"> </w:t>
@@ -1266,7 +1015,7 @@
         <w:t xml:space="preserve"> </w:t>
       </w:r>
       <w:r>
-        <w:t xml:space="preserve">the corresponding games were played and only graded afterward using</w:t>
+        <w:t xml:space="preserve">its game was played and graded afterward via</w:t>
       </w:r>
       <w:r>
         <w:t xml:space="preserve"> </w:t>
@@ -1278,7 +1027,10 @@
         <w:t xml:space="preserve">Plot.ipynb</w:t>
       </w:r>
       <w:r>
-        <w:t xml:space="preserve">, which independently fetches actual game results via</w:t>
+        <w:t xml:space="preserve"> </w:t>
+      </w:r>
+      <w:r>
+        <w:t xml:space="preserve">against real results fetched from</w:t>
       </w:r>
       <w:r>
         <w:t xml:space="preserve"> </w:t>
@@ -1293,22 +1045,7 @@
         <w:t xml:space="preserve"> </w:t>
       </w:r>
       <w:r>
-        <w:t xml:space="preserve">and compares them to the saved</w:t>
-      </w:r>
-      <w:r>
-        <w:t xml:space="preserve"> </w:t>
-      </w:r>
-      <w:r>
-        <w:rPr>
-          <w:rStyle w:val="VerbatimChar"/>
-        </w:rPr>
-        <w:t xml:space="preserve">week{N}_predictions.csv</w:t>
-      </w:r>
-      <w:r>
-        <w:t xml:space="preserve"> </w:t>
-      </w:r>
-      <w:r>
-        <w:t xml:space="preserve">files. This means the Results section below reflects genuinely prospective forecasting performance across an entire season, not a retrospective holdout split.</w:t>
+        <w:t xml:space="preserve">— genuinely prospective performance across a full season, not a retrospective holdout split.</w:t>
       </w:r>
     </w:p>
     <w:p>
@@ -1320,7 +1057,7 @@
     </w:p>
     <w:bookmarkEnd w:id="21"/>
     <w:bookmarkEnd w:id="22"/>
-    <w:bookmarkStart w:id="41" w:name="results"/>
+    <w:bookmarkStart w:id="37" w:name="results"/>
     <w:p>
       <w:pPr>
         <w:pStyle w:val="Heading2"/>
@@ -1343,7 +1080,7 @@
         <w:pStyle w:val="FirstParagraph"/>
       </w:pPr>
       <w:r>
-        <w:t xml:space="preserve">Across all 22 weeks of the 2025 season, the system generated 283 graded predictions (one game, Week 4 GB @ DAL, ended 40–40 and is excluded as neither team</w:t>
+        <w:t xml:space="preserve">Across all 22 weeks, the system generated 283 graded predictions (Week 4 GB @ DAL ended 40–40 and is excluded as neither team</w:t>
       </w:r>
       <w:r>
         <w:t xml:space="preserve"> </w:t>
@@ -1438,7 +1175,7 @@
               <w:pStyle w:val="Compact"/>
             </w:pPr>
             <w:r>
-              <w:t xml:space="preserve">Best week</w:t>
+              <w:t xml:space="preserve">Best / worst week</w:t>
             </w:r>
           </w:p>
         </w:tc>
@@ -1449,31 +1186,7 @@
               <w:pStyle w:val="Compact"/>
             </w:pPr>
             <w:r>
-              <w:t xml:space="preserve">Week 22 (100%, 1/1 games — small sample)</w:t>
-            </w:r>
-          </w:p>
-        </w:tc>
-      </w:tr>
-      <w:tr>
-        <w:tc>
-          <w:tcPr/>
-          <w:p>
-            <w:pPr>
-              <w:pStyle w:val="Compact"/>
-            </w:pPr>
-            <w:r>
-              <w:t xml:space="preserve">Worst week</w:t>
-            </w:r>
-          </w:p>
-        </w:tc>
-        <w:tc>
-          <w:tcPr/>
-          <w:p>
-            <w:pPr>
-              <w:pStyle w:val="Compact"/>
-            </w:pPr>
-            <w:r>
-              <w:t xml:space="preserve">Week 19 (16.7%, 1/6 games)</w:t>
+              <w:t xml:space="preserve">Week 22, 100% (1/1) / Week 19, 16.7% (1/6)</w:t>
             </w:r>
           </w:p>
         </w:tc>
@@ -1497,31 +1210,7 @@
               <w:pStyle w:val="Compact"/>
             </w:pPr>
             <w:r>
-              <w:t xml:space="preserve">16.7% – 100%</w:t>
-            </w:r>
-          </w:p>
-        </w:tc>
-      </w:tr>
-      <w:tr>
-        <w:tc>
-          <w:tcPr/>
-          <w:p>
-            <w:pPr>
-              <w:pStyle w:val="Compact"/>
-            </w:pPr>
-            <w:r>
-              <w:t xml:space="preserve">Weekly accuracy standard deviation</w:t>
-            </w:r>
-          </w:p>
-        </w:tc>
-        <w:tc>
-          <w:tcPr/>
-          <w:p>
-            <w:pPr>
-              <w:pStyle w:val="Compact"/>
-            </w:pPr>
-            <w:r>
-              <w:t xml:space="preserve">±19.3 percentage points</w:t>
+              <w:t xml:space="preserve">16.7% – 100% (σ = ±19.3 pts)</w:t>
             </w:r>
           </w:p>
         </w:tc>
@@ -1542,7 +1231,7 @@
         <w:pStyle w:val="FirstParagraph"/>
       </w:pPr>
       <w:r>
-        <w:t xml:space="preserve">Because the ensemble architecture changed after Week 9 (Section 3.3), the season naturally splits into two comparable stretches:</w:t>
+        <w:t xml:space="preserve">Because the ensemble architecture changed after Week 9 (Section 3.3), the season splits into two comparable stretches:</w:t>
       </w:r>
     </w:p>
     <w:tbl>
@@ -1747,7 +1436,7 @@
         <w:pStyle w:val="BodyText"/>
       </w:pPr>
       <w:r>
-        <w:t xml:space="preserve">This is the single most important — and most honest — finding of this project: the enhanced architecture, despite substantially more modeling machinery (an additional base learner, deeper trees, temporal weighting, and several new engineered features), performed</w:t>
+        <w:t xml:space="preserve">This is the single most important — and most honest — finding of this project: the enhanced architecture, despite substantially more modeling machinery, performed</w:t>
       </w:r>
       <w:r>
         <w:t xml:space="preserve"> </w:t>
@@ -1763,1121 +1452,17 @@
         <w:t xml:space="preserve"> </w:t>
       </w:r>
       <w:r>
-        <w:t xml:space="preserve">in live, prospective use than the simpler legacy model it replaced, missing its own internally documented target of 66–68% accuracy by a wide margin. Section 5 discusses possible explanations.</w:t>
+        <w:t xml:space="preserve">in live, prospective use than the simpler legacy model it replaced, missing its own internally documented 66–68% target by a wide margin. Section 5 discusses why.</w:t>
       </w:r>
     </w:p>
     <w:bookmarkEnd w:id="24"/>
-    <w:bookmarkStart w:id="25" w:name="week-by-week-breakdown"/>
+    <w:bookmarkStart w:id="28" w:name="week-by-week-pattern"/>
     <w:p>
       <w:pPr>
         <w:pStyle w:val="Heading3"/>
       </w:pPr>
       <w:r>
-        <w:t xml:space="preserve">4.3 Week-by-Week Breakdown</w:t>
-      </w:r>
-    </w:p>
-    <w:tbl>
-      <w:tblPr>
-        <w:tblStyle w:val="Table"/>
-        <w:tblW w:type="auto" w:w="0"/>
-        <w:tblLook w:firstRow="1" w:lastRow="0" w:firstColumn="0" w:lastColumn="0" w:noHBand="0" w:noVBand="0" w:val="0020"/>
-      </w:tblPr>
-      <w:tblGrid>
-        <w:gridCol w:w="1980"/>
-        <w:gridCol w:w="1980"/>
-        <w:gridCol w:w="1980"/>
-        <w:gridCol w:w="1980"/>
-      </w:tblGrid>
-      <w:tr>
-        <w:trPr>
-          <w:tblHeader w:val="on"/>
-        </w:trPr>
-        <w:tc>
-          <w:tcPr/>
-          <w:p>
-            <w:pPr>
-              <w:pStyle w:val="Compact"/>
-            </w:pPr>
-            <w:r>
-              <w:t xml:space="preserve">Week</w:t>
-            </w:r>
-          </w:p>
-        </w:tc>
-        <w:tc>
-          <w:tcPr/>
-          <w:p>
-            <w:pPr>
-              <w:pStyle w:val="Compact"/>
-            </w:pPr>
-            <w:r>
-              <w:t xml:space="preserve">Games</w:t>
-            </w:r>
-          </w:p>
-        </w:tc>
-        <w:tc>
-          <w:tcPr/>
-          <w:p>
-            <w:pPr>
-              <w:pStyle w:val="Compact"/>
-            </w:pPr>
-            <w:r>
-              <w:t xml:space="preserve">Correct</w:t>
-            </w:r>
-          </w:p>
-        </w:tc>
-        <w:tc>
-          <w:tcPr/>
-          <w:p>
-            <w:pPr>
-              <w:pStyle w:val="Compact"/>
-            </w:pPr>
-            <w:r>
-              <w:t xml:space="preserve">Accuracy</w:t>
-            </w:r>
-          </w:p>
-        </w:tc>
-      </w:tr>
-      <w:tr>
-        <w:tc>
-          <w:tcPr/>
-          <w:p>
-            <w:pPr>
-              <w:pStyle w:val="Compact"/>
-            </w:pPr>
-            <w:r>
-              <w:t xml:space="preserve">1</w:t>
-            </w:r>
-          </w:p>
-        </w:tc>
-        <w:tc>
-          <w:tcPr/>
-          <w:p>
-            <w:pPr>
-              <w:pStyle w:val="Compact"/>
-            </w:pPr>
-            <w:r>
-              <w:t xml:space="preserve">16</w:t>
-            </w:r>
-          </w:p>
-        </w:tc>
-        <w:tc>
-          <w:tcPr/>
-          <w:p>
-            <w:pPr>
-              <w:pStyle w:val="Compact"/>
-            </w:pPr>
-            <w:r>
-              <w:t xml:space="preserve">10</w:t>
-            </w:r>
-          </w:p>
-        </w:tc>
-        <w:tc>
-          <w:tcPr/>
-          <w:p>
-            <w:pPr>
-              <w:pStyle w:val="Compact"/>
-            </w:pPr>
-            <w:r>
-              <w:t xml:space="preserve">62.5%</w:t>
-            </w:r>
-          </w:p>
-        </w:tc>
-      </w:tr>
-      <w:tr>
-        <w:tc>
-          <w:tcPr/>
-          <w:p>
-            <w:pPr>
-              <w:pStyle w:val="Compact"/>
-            </w:pPr>
-            <w:r>
-              <w:t xml:space="preserve">2</w:t>
-            </w:r>
-          </w:p>
-        </w:tc>
-        <w:tc>
-          <w:tcPr/>
-          <w:p>
-            <w:pPr>
-              <w:pStyle w:val="Compact"/>
-            </w:pPr>
-            <w:r>
-              <w:t xml:space="preserve">16</w:t>
-            </w:r>
-          </w:p>
-        </w:tc>
-        <w:tc>
-          <w:tcPr/>
-          <w:p>
-            <w:pPr>
-              <w:pStyle w:val="Compact"/>
-            </w:pPr>
-            <w:r>
-              <w:t xml:space="preserve">9</w:t>
-            </w:r>
-          </w:p>
-        </w:tc>
-        <w:tc>
-          <w:tcPr/>
-          <w:p>
-            <w:pPr>
-              <w:pStyle w:val="Compact"/>
-            </w:pPr>
-            <w:r>
-              <w:t xml:space="preserve">56.2%</w:t>
-            </w:r>
-          </w:p>
-        </w:tc>
-      </w:tr>
-      <w:tr>
-        <w:tc>
-          <w:tcPr/>
-          <w:p>
-            <w:pPr>
-              <w:pStyle w:val="Compact"/>
-            </w:pPr>
-            <w:r>
-              <w:t xml:space="preserve">3</w:t>
-            </w:r>
-          </w:p>
-        </w:tc>
-        <w:tc>
-          <w:tcPr/>
-          <w:p>
-            <w:pPr>
-              <w:pStyle w:val="Compact"/>
-            </w:pPr>
-            <w:r>
-              <w:t xml:space="preserve">16</w:t>
-            </w:r>
-          </w:p>
-        </w:tc>
-        <w:tc>
-          <w:tcPr/>
-          <w:p>
-            <w:pPr>
-              <w:pStyle w:val="Compact"/>
-            </w:pPr>
-            <w:r>
-              <w:t xml:space="preserve">14</w:t>
-            </w:r>
-          </w:p>
-        </w:tc>
-        <w:tc>
-          <w:tcPr/>
-          <w:p>
-            <w:pPr>
-              <w:pStyle w:val="Compact"/>
-            </w:pPr>
-            <w:r>
-              <w:t xml:space="preserve">87.5%</w:t>
-            </w:r>
-          </w:p>
-        </w:tc>
-      </w:tr>
-      <w:tr>
-        <w:tc>
-          <w:tcPr/>
-          <w:p>
-            <w:pPr>
-              <w:pStyle w:val="Compact"/>
-            </w:pPr>
-            <w:r>
-              <w:t xml:space="preserve">4</w:t>
-            </w:r>
-          </w:p>
-        </w:tc>
-        <w:tc>
-          <w:tcPr/>
-          <w:p>
-            <w:pPr>
-              <w:pStyle w:val="Compact"/>
-            </w:pPr>
-            <w:r>
-              <w:t xml:space="preserve">15</w:t>
-            </w:r>
-          </w:p>
-        </w:tc>
-        <w:tc>
-          <w:tcPr/>
-          <w:p>
-            <w:pPr>
-              <w:pStyle w:val="Compact"/>
-            </w:pPr>
-            <w:r>
-              <w:t xml:space="preserve">8</w:t>
-            </w:r>
-          </w:p>
-        </w:tc>
-        <w:tc>
-          <w:tcPr/>
-          <w:p>
-            <w:pPr>
-              <w:pStyle w:val="Compact"/>
-            </w:pPr>
-            <w:r>
-              <w:t xml:space="preserve">53.3%</w:t>
-            </w:r>
-          </w:p>
-        </w:tc>
-      </w:tr>
-      <w:tr>
-        <w:tc>
-          <w:tcPr/>
-          <w:p>
-            <w:pPr>
-              <w:pStyle w:val="Compact"/>
-            </w:pPr>
-            <w:r>
-              <w:t xml:space="preserve">5</w:t>
-            </w:r>
-          </w:p>
-        </w:tc>
-        <w:tc>
-          <w:tcPr/>
-          <w:p>
-            <w:pPr>
-              <w:pStyle w:val="Compact"/>
-            </w:pPr>
-            <w:r>
-              <w:t xml:space="preserve">14</w:t>
-            </w:r>
-          </w:p>
-        </w:tc>
-        <w:tc>
-          <w:tcPr/>
-          <w:p>
-            <w:pPr>
-              <w:pStyle w:val="Compact"/>
-            </w:pPr>
-            <w:r>
-              <w:t xml:space="preserve">6</w:t>
-            </w:r>
-          </w:p>
-        </w:tc>
-        <w:tc>
-          <w:tcPr/>
-          <w:p>
-            <w:pPr>
-              <w:pStyle w:val="Compact"/>
-            </w:pPr>
-            <w:r>
-              <w:t xml:space="preserve">42.9%</w:t>
-            </w:r>
-          </w:p>
-        </w:tc>
-      </w:tr>
-      <w:tr>
-        <w:tc>
-          <w:tcPr/>
-          <w:p>
-            <w:pPr>
-              <w:pStyle w:val="Compact"/>
-            </w:pPr>
-            <w:r>
-              <w:t xml:space="preserve">6</w:t>
-            </w:r>
-          </w:p>
-        </w:tc>
-        <w:tc>
-          <w:tcPr/>
-          <w:p>
-            <w:pPr>
-              <w:pStyle w:val="Compact"/>
-            </w:pPr>
-            <w:r>
-              <w:t xml:space="preserve">15</w:t>
-            </w:r>
-          </w:p>
-        </w:tc>
-        <w:tc>
-          <w:tcPr/>
-          <w:p>
-            <w:pPr>
-              <w:pStyle w:val="Compact"/>
-            </w:pPr>
-            <w:r>
-              <w:t xml:space="preserve">6</w:t>
-            </w:r>
-          </w:p>
-        </w:tc>
-        <w:tc>
-          <w:tcPr/>
-          <w:p>
-            <w:pPr>
-              <w:pStyle w:val="Compact"/>
-            </w:pPr>
-            <w:r>
-              <w:t xml:space="preserve">40.0%</w:t>
-            </w:r>
-          </w:p>
-        </w:tc>
-      </w:tr>
-      <w:tr>
-        <w:tc>
-          <w:tcPr/>
-          <w:p>
-            <w:pPr>
-              <w:pStyle w:val="Compact"/>
-            </w:pPr>
-            <w:r>
-              <w:t xml:space="preserve">7</w:t>
-            </w:r>
-          </w:p>
-        </w:tc>
-        <w:tc>
-          <w:tcPr/>
-          <w:p>
-            <w:pPr>
-              <w:pStyle w:val="Compact"/>
-            </w:pPr>
-            <w:r>
-              <w:t xml:space="preserve">15</w:t>
-            </w:r>
-          </w:p>
-        </w:tc>
-        <w:tc>
-          <w:tcPr/>
-          <w:p>
-            <w:pPr>
-              <w:pStyle w:val="Compact"/>
-            </w:pPr>
-            <w:r>
-              <w:t xml:space="preserve">9</w:t>
-            </w:r>
-          </w:p>
-        </w:tc>
-        <w:tc>
-          <w:tcPr/>
-          <w:p>
-            <w:pPr>
-              <w:pStyle w:val="Compact"/>
-            </w:pPr>
-            <w:r>
-              <w:t xml:space="preserve">60.0%</w:t>
-            </w:r>
-          </w:p>
-        </w:tc>
-      </w:tr>
-      <w:tr>
-        <w:tc>
-          <w:tcPr/>
-          <w:p>
-            <w:pPr>
-              <w:pStyle w:val="Compact"/>
-            </w:pPr>
-            <w:r>
-              <w:t xml:space="preserve">8</w:t>
-            </w:r>
-          </w:p>
-        </w:tc>
-        <w:tc>
-          <w:tcPr/>
-          <w:p>
-            <w:pPr>
-              <w:pStyle w:val="Compact"/>
-            </w:pPr>
-            <w:r>
-              <w:t xml:space="preserve">13</w:t>
-            </w:r>
-          </w:p>
-        </w:tc>
-        <w:tc>
-          <w:tcPr/>
-          <w:p>
-            <w:pPr>
-              <w:pStyle w:val="Compact"/>
-            </w:pPr>
-            <w:r>
-              <w:t xml:space="preserve">11</w:t>
-            </w:r>
-          </w:p>
-        </w:tc>
-        <w:tc>
-          <w:tcPr/>
-          <w:p>
-            <w:pPr>
-              <w:pStyle w:val="Compact"/>
-            </w:pPr>
-            <w:r>
-              <w:t xml:space="preserve">84.6%</w:t>
-            </w:r>
-          </w:p>
-        </w:tc>
-      </w:tr>
-      <w:tr>
-        <w:tc>
-          <w:tcPr/>
-          <w:p>
-            <w:pPr>
-              <w:pStyle w:val="Compact"/>
-            </w:pPr>
-            <w:r>
-              <w:t xml:space="preserve">9</w:t>
-            </w:r>
-          </w:p>
-        </w:tc>
-        <w:tc>
-          <w:tcPr/>
-          <w:p>
-            <w:pPr>
-              <w:pStyle w:val="Compact"/>
-            </w:pPr>
-            <w:r>
-              <w:t xml:space="preserve">14</w:t>
-            </w:r>
-          </w:p>
-        </w:tc>
-        <w:tc>
-          <w:tcPr/>
-          <w:p>
-            <w:pPr>
-              <w:pStyle w:val="Compact"/>
-            </w:pPr>
-            <w:r>
-              <w:t xml:space="preserve">8</w:t>
-            </w:r>
-          </w:p>
-        </w:tc>
-        <w:tc>
-          <w:tcPr/>
-          <w:p>
-            <w:pPr>
-              <w:pStyle w:val="Compact"/>
-            </w:pPr>
-            <w:r>
-              <w:t xml:space="preserve">57.1%</w:t>
-            </w:r>
-          </w:p>
-        </w:tc>
-      </w:tr>
-      <w:tr>
-        <w:tc>
-          <w:tcPr/>
-          <w:p>
-            <w:pPr>
-              <w:pStyle w:val="Compact"/>
-            </w:pPr>
-            <w:r>
-              <w:t xml:space="preserve">10</w:t>
-            </w:r>
-          </w:p>
-        </w:tc>
-        <w:tc>
-          <w:tcPr/>
-          <w:p>
-            <w:pPr>
-              <w:pStyle w:val="Compact"/>
-            </w:pPr>
-            <w:r>
-              <w:t xml:space="preserve">14</w:t>
-            </w:r>
-          </w:p>
-        </w:tc>
-        <w:tc>
-          <w:tcPr/>
-          <w:p>
-            <w:pPr>
-              <w:pStyle w:val="Compact"/>
-            </w:pPr>
-            <w:r>
-              <w:t xml:space="preserve">7</w:t>
-            </w:r>
-          </w:p>
-        </w:tc>
-        <w:tc>
-          <w:tcPr/>
-          <w:p>
-            <w:pPr>
-              <w:pStyle w:val="Compact"/>
-            </w:pPr>
-            <w:r>
-              <w:t xml:space="preserve">50.0%</w:t>
-            </w:r>
-          </w:p>
-        </w:tc>
-      </w:tr>
-      <w:tr>
-        <w:tc>
-          <w:tcPr/>
-          <w:p>
-            <w:pPr>
-              <w:pStyle w:val="Compact"/>
-            </w:pPr>
-            <w:r>
-              <w:t xml:space="preserve">11</w:t>
-            </w:r>
-          </w:p>
-        </w:tc>
-        <w:tc>
-          <w:tcPr/>
-          <w:p>
-            <w:pPr>
-              <w:pStyle w:val="Compact"/>
-            </w:pPr>
-            <w:r>
-              <w:t xml:space="preserve">15</w:t>
-            </w:r>
-          </w:p>
-        </w:tc>
-        <w:tc>
-          <w:tcPr/>
-          <w:p>
-            <w:pPr>
-              <w:pStyle w:val="Compact"/>
-            </w:pPr>
-            <w:r>
-              <w:t xml:space="preserve">8</w:t>
-            </w:r>
-          </w:p>
-        </w:tc>
-        <w:tc>
-          <w:tcPr/>
-          <w:p>
-            <w:pPr>
-              <w:pStyle w:val="Compact"/>
-            </w:pPr>
-            <w:r>
-              <w:t xml:space="preserve">53.3%</w:t>
-            </w:r>
-          </w:p>
-        </w:tc>
-      </w:tr>
-      <w:tr>
-        <w:tc>
-          <w:tcPr/>
-          <w:p>
-            <w:pPr>
-              <w:pStyle w:val="Compact"/>
-            </w:pPr>
-            <w:r>
-              <w:t xml:space="preserve">12</w:t>
-            </w:r>
-          </w:p>
-        </w:tc>
-        <w:tc>
-          <w:tcPr/>
-          <w:p>
-            <w:pPr>
-              <w:pStyle w:val="Compact"/>
-            </w:pPr>
-            <w:r>
-              <w:t xml:space="preserve">13</w:t>
-            </w:r>
-          </w:p>
-        </w:tc>
-        <w:tc>
-          <w:tcPr/>
-          <w:p>
-            <w:pPr>
-              <w:pStyle w:val="Compact"/>
-            </w:pPr>
-            <w:r>
-              <w:t xml:space="preserve">9</w:t>
-            </w:r>
-          </w:p>
-        </w:tc>
-        <w:tc>
-          <w:tcPr/>
-          <w:p>
-            <w:pPr>
-              <w:pStyle w:val="Compact"/>
-            </w:pPr>
-            <w:r>
-              <w:t xml:space="preserve">69.2%</w:t>
-            </w:r>
-          </w:p>
-        </w:tc>
-      </w:tr>
-      <w:tr>
-        <w:tc>
-          <w:tcPr/>
-          <w:p>
-            <w:pPr>
-              <w:pStyle w:val="Compact"/>
-            </w:pPr>
-            <w:r>
-              <w:t xml:space="preserve">13</w:t>
-            </w:r>
-          </w:p>
-        </w:tc>
-        <w:tc>
-          <w:tcPr/>
-          <w:p>
-            <w:pPr>
-              <w:pStyle w:val="Compact"/>
-            </w:pPr>
-            <w:r>
-              <w:t xml:space="preserve">16</w:t>
-            </w:r>
-          </w:p>
-        </w:tc>
-        <w:tc>
-          <w:tcPr/>
-          <w:p>
-            <w:pPr>
-              <w:pStyle w:val="Compact"/>
-            </w:pPr>
-            <w:r>
-              <w:t xml:space="preserve">8</w:t>
-            </w:r>
-          </w:p>
-        </w:tc>
-        <w:tc>
-          <w:tcPr/>
-          <w:p>
-            <w:pPr>
-              <w:pStyle w:val="Compact"/>
-            </w:pPr>
-            <w:r>
-              <w:t xml:space="preserve">50.0%</w:t>
-            </w:r>
-          </w:p>
-        </w:tc>
-      </w:tr>
-      <w:tr>
-        <w:tc>
-          <w:tcPr/>
-          <w:p>
-            <w:pPr>
-              <w:pStyle w:val="Compact"/>
-            </w:pPr>
-            <w:r>
-              <w:t xml:space="preserve">14</w:t>
-            </w:r>
-          </w:p>
-        </w:tc>
-        <w:tc>
-          <w:tcPr/>
-          <w:p>
-            <w:pPr>
-              <w:pStyle w:val="Compact"/>
-            </w:pPr>
-            <w:r>
-              <w:t xml:space="preserve">14</w:t>
-            </w:r>
-          </w:p>
-        </w:tc>
-        <w:tc>
-          <w:tcPr/>
-          <w:p>
-            <w:pPr>
-              <w:pStyle w:val="Compact"/>
-            </w:pPr>
-            <w:r>
-              <w:t xml:space="preserve">6</w:t>
-            </w:r>
-          </w:p>
-        </w:tc>
-        <w:tc>
-          <w:tcPr/>
-          <w:p>
-            <w:pPr>
-              <w:pStyle w:val="Compact"/>
-            </w:pPr>
-            <w:r>
-              <w:t xml:space="preserve">42.9%</w:t>
-            </w:r>
-          </w:p>
-        </w:tc>
-      </w:tr>
-      <w:tr>
-        <w:tc>
-          <w:tcPr/>
-          <w:p>
-            <w:pPr>
-              <w:pStyle w:val="Compact"/>
-            </w:pPr>
-            <w:r>
-              <w:t xml:space="preserve">15</w:t>
-            </w:r>
-          </w:p>
-        </w:tc>
-        <w:tc>
-          <w:tcPr/>
-          <w:p>
-            <w:pPr>
-              <w:pStyle w:val="Compact"/>
-            </w:pPr>
-            <w:r>
-              <w:t xml:space="preserve">16</w:t>
-            </w:r>
-          </w:p>
-        </w:tc>
-        <w:tc>
-          <w:tcPr/>
-          <w:p>
-            <w:pPr>
-              <w:pStyle w:val="Compact"/>
-            </w:pPr>
-            <w:r>
-              <w:t xml:space="preserve">9</w:t>
-            </w:r>
-          </w:p>
-        </w:tc>
-        <w:tc>
-          <w:tcPr/>
-          <w:p>
-            <w:pPr>
-              <w:pStyle w:val="Compact"/>
-            </w:pPr>
-            <w:r>
-              <w:t xml:space="preserve">56.2%</w:t>
-            </w:r>
-          </w:p>
-        </w:tc>
-      </w:tr>
-      <w:tr>
-        <w:tc>
-          <w:tcPr/>
-          <w:p>
-            <w:pPr>
-              <w:pStyle w:val="Compact"/>
-            </w:pPr>
-            <w:r>
-              <w:t xml:space="preserve">16</w:t>
-            </w:r>
-          </w:p>
-        </w:tc>
-        <w:tc>
-          <w:tcPr/>
-          <w:p>
-            <w:pPr>
-              <w:pStyle w:val="Compact"/>
-            </w:pPr>
-            <w:r>
-              <w:t xml:space="preserve">16</w:t>
-            </w:r>
-          </w:p>
-        </w:tc>
-        <w:tc>
-          <w:tcPr/>
-          <w:p>
-            <w:pPr>
-              <w:pStyle w:val="Compact"/>
-            </w:pPr>
-            <w:r>
-              <w:t xml:space="preserve">5</w:t>
-            </w:r>
-          </w:p>
-        </w:tc>
-        <w:tc>
-          <w:tcPr/>
-          <w:p>
-            <w:pPr>
-              <w:pStyle w:val="Compact"/>
-            </w:pPr>
-            <w:r>
-              <w:t xml:space="preserve">31.2%</w:t>
-            </w:r>
-          </w:p>
-        </w:tc>
-      </w:tr>
-      <w:tr>
-        <w:tc>
-          <w:tcPr/>
-          <w:p>
-            <w:pPr>
-              <w:pStyle w:val="Compact"/>
-            </w:pPr>
-            <w:r>
-              <w:t xml:space="preserve">17</w:t>
-            </w:r>
-          </w:p>
-        </w:tc>
-        <w:tc>
-          <w:tcPr/>
-          <w:p>
-            <w:pPr>
-              <w:pStyle w:val="Compact"/>
-            </w:pPr>
-            <w:r>
-              <w:t xml:space="preserve">16</w:t>
-            </w:r>
-          </w:p>
-        </w:tc>
-        <w:tc>
-          <w:tcPr/>
-          <w:p>
-            <w:pPr>
-              <w:pStyle w:val="Compact"/>
-            </w:pPr>
-            <w:r>
-              <w:t xml:space="preserve">4</w:t>
-            </w:r>
-          </w:p>
-        </w:tc>
-        <w:tc>
-          <w:tcPr/>
-          <w:p>
-            <w:pPr>
-              <w:pStyle w:val="Compact"/>
-            </w:pPr>
-            <w:r>
-              <w:t xml:space="preserve">25.0%</w:t>
-            </w:r>
-          </w:p>
-        </w:tc>
-      </w:tr>
-      <w:tr>
-        <w:tc>
-          <w:tcPr/>
-          <w:p>
-            <w:pPr>
-              <w:pStyle w:val="Compact"/>
-            </w:pPr>
-            <w:r>
-              <w:t xml:space="preserve">18</w:t>
-            </w:r>
-          </w:p>
-        </w:tc>
-        <w:tc>
-          <w:tcPr/>
-          <w:p>
-            <w:pPr>
-              <w:pStyle w:val="Compact"/>
-            </w:pPr>
-            <w:r>
-              <w:t xml:space="preserve">16</w:t>
-            </w:r>
-          </w:p>
-        </w:tc>
-        <w:tc>
-          <w:tcPr/>
-          <w:p>
-            <w:pPr>
-              <w:pStyle w:val="Compact"/>
-            </w:pPr>
-            <w:r>
-              <w:t xml:space="preserve">12</w:t>
-            </w:r>
-          </w:p>
-        </w:tc>
-        <w:tc>
-          <w:tcPr/>
-          <w:p>
-            <w:pPr>
-              <w:pStyle w:val="Compact"/>
-            </w:pPr>
-            <w:r>
-              <w:t xml:space="preserve">75.0%</w:t>
-            </w:r>
-          </w:p>
-        </w:tc>
-      </w:tr>
-      <w:tr>
-        <w:tc>
-          <w:tcPr/>
-          <w:p>
-            <w:pPr>
-              <w:pStyle w:val="Compact"/>
-            </w:pPr>
-            <w:r>
-              <w:t xml:space="preserve">19</w:t>
-            </w:r>
-          </w:p>
-        </w:tc>
-        <w:tc>
-          <w:tcPr/>
-          <w:p>
-            <w:pPr>
-              <w:pStyle w:val="Compact"/>
-            </w:pPr>
-            <w:r>
-              <w:t xml:space="preserve">6</w:t>
-            </w:r>
-          </w:p>
-        </w:tc>
-        <w:tc>
-          <w:tcPr/>
-          <w:p>
-            <w:pPr>
-              <w:pStyle w:val="Compact"/>
-            </w:pPr>
-            <w:r>
-              <w:t xml:space="preserve">1</w:t>
-            </w:r>
-          </w:p>
-        </w:tc>
-        <w:tc>
-          <w:tcPr/>
-          <w:p>
-            <w:pPr>
-              <w:pStyle w:val="Compact"/>
-            </w:pPr>
-            <w:r>
-              <w:t xml:space="preserve">16.7%</w:t>
-            </w:r>
-          </w:p>
-        </w:tc>
-      </w:tr>
-      <w:tr>
-        <w:tc>
-          <w:tcPr/>
-          <w:p>
-            <w:pPr>
-              <w:pStyle w:val="Compact"/>
-            </w:pPr>
-            <w:r>
-              <w:t xml:space="preserve">20</w:t>
-            </w:r>
-          </w:p>
-        </w:tc>
-        <w:tc>
-          <w:tcPr/>
-          <w:p>
-            <w:pPr>
-              <w:pStyle w:val="Compact"/>
-            </w:pPr>
-            <w:r>
-              <w:t xml:space="preserve">4</w:t>
-            </w:r>
-          </w:p>
-        </w:tc>
-        <w:tc>
-          <w:tcPr/>
-          <w:p>
-            <w:pPr>
-              <w:pStyle w:val="Compact"/>
-            </w:pPr>
-            <w:r>
-              <w:t xml:space="preserve">2</w:t>
-            </w:r>
-          </w:p>
-        </w:tc>
-        <w:tc>
-          <w:tcPr/>
-          <w:p>
-            <w:pPr>
-              <w:pStyle w:val="Compact"/>
-            </w:pPr>
-            <w:r>
-              <w:t xml:space="preserve">50.0%</w:t>
-            </w:r>
-          </w:p>
-        </w:tc>
-      </w:tr>
-      <w:tr>
-        <w:tc>
-          <w:tcPr/>
-          <w:p>
-            <w:pPr>
-              <w:pStyle w:val="Compact"/>
-            </w:pPr>
-            <w:r>
-              <w:t xml:space="preserve">21</w:t>
-            </w:r>
-          </w:p>
-        </w:tc>
-        <w:tc>
-          <w:tcPr/>
-          <w:p>
-            <w:pPr>
-              <w:pStyle w:val="Compact"/>
-            </w:pPr>
-            <w:r>
-              <w:t xml:space="preserve">2</w:t>
-            </w:r>
-          </w:p>
-        </w:tc>
-        <w:tc>
-          <w:tcPr/>
-          <w:p>
-            <w:pPr>
-              <w:pStyle w:val="Compact"/>
-            </w:pPr>
-            <w:r>
-              <w:t xml:space="preserve">1</w:t>
-            </w:r>
-          </w:p>
-        </w:tc>
-        <w:tc>
-          <w:tcPr/>
-          <w:p>
-            <w:pPr>
-              <w:pStyle w:val="Compact"/>
-            </w:pPr>
-            <w:r>
-              <w:t xml:space="preserve">50.0%</w:t>
-            </w:r>
-          </w:p>
-        </w:tc>
-      </w:tr>
-      <w:tr>
-        <w:tc>
-          <w:tcPr/>
-          <w:p>
-            <w:pPr>
-              <w:pStyle w:val="Compact"/>
-            </w:pPr>
-            <w:r>
-              <w:t xml:space="preserve">22</w:t>
-            </w:r>
-          </w:p>
-        </w:tc>
-        <w:tc>
-          <w:tcPr/>
-          <w:p>
-            <w:pPr>
-              <w:pStyle w:val="Compact"/>
-            </w:pPr>
-            <w:r>
-              <w:t xml:space="preserve">1</w:t>
-            </w:r>
-          </w:p>
-        </w:tc>
-        <w:tc>
-          <w:tcPr/>
-          <w:p>
-            <w:pPr>
-              <w:pStyle w:val="Compact"/>
-            </w:pPr>
-            <w:r>
-              <w:t xml:space="preserve">1</w:t>
-            </w:r>
-          </w:p>
-        </w:tc>
-        <w:tc>
-          <w:tcPr/>
-          <w:p>
-            <w:pPr>
-              <w:pStyle w:val="Compact"/>
-            </w:pPr>
-            <w:r>
-              <w:t xml:space="preserve">100.0%</w:t>
-            </w:r>
-          </w:p>
-        </w:tc>
-      </w:tr>
-    </w:tbl>
-    <w:p>
-      <w:pPr>
-        <w:pStyle w:val="BodyText"/>
-      </w:pPr>
-      <w:r>
-        <w:t xml:space="preserve">Weeks 16, 17, and 19 stand out as unusually poor stretches (25–31% accuracy, well below even a coin-flip baseline), all falling within the</w:t>
-      </w:r>
-      <w:r>
-        <w:t xml:space="preserve"> </w:t>
-      </w:r>
-      <w:r>
-        <w:t xml:space="preserve">“enhanced”</w:t>
-      </w:r>
-      <w:r>
-        <w:t xml:space="preserve"> </w:t>
-      </w:r>
-      <w:r>
-        <w:t xml:space="preserve">model period and coinciding with late-season weeks where playoff seeding implications can alter team behavior (rest for starters, lineup changes) in ways not captured by the model’s season-to-date statistical features.</w:t>
-      </w:r>
-    </w:p>
-    <w:bookmarkEnd w:id="25"/>
-    <w:bookmarkStart w:id="32" w:name="visualizations"/>
-    <w:p>
-      <w:pPr>
-        <w:pStyle w:val="Heading3"/>
-      </w:pPr>
-      <w:r>
-        <w:t xml:space="preserve">4.4 Visualizations</w:t>
+        <w:t xml:space="preserve">4.3 Week-by-Week Pattern</w:t>
       </w:r>
     </w:p>
     <w:p>
@@ -2885,43 +1470,7 @@
         <w:pStyle w:val="FirstParagraph"/>
       </w:pPr>
       <w:r>
-        <w:rPr>
-          <w:rStyle w:val="VerbatimChar"/>
-        </w:rPr>
-        <w:t xml:space="preserve">Plot.ipynb</w:t>
-      </w:r>
-      <w:r>
-        <w:t xml:space="preserve"> </w:t>
-      </w:r>
-      <w:r>
-        <w:t xml:space="preserve">generates four visualizations from the aggregated weekly statistics: (1) a weekly accuracy line chart with a 50% baseline reference and shaded over/under-performance regions, (2) cumulative accuracy progression across the season, (3) a grouped bar chart of correct vs. incorrect predictions per week, and (4) high-confidence pick (&gt;65% confidence) performance isolated from the full sample. These are produced directly from the notebook and are available by re-running</w:t>
-      </w:r>
-      <w:r>
-        <w:t xml:space="preserve"> </w:t>
-      </w:r>
-      <w:r>
-        <w:rPr>
-          <w:rStyle w:val="VerbatimChar"/>
-        </w:rPr>
-        <w:t xml:space="preserve">Plot.ipynb</w:t>
-      </w:r>
-      <w:r>
-        <w:t xml:space="preserve"> </w:t>
-      </w:r>
-      <w:r>
-        <w:t xml:space="preserve">with</w:t>
-      </w:r>
-      <w:r>
-        <w:t xml:space="preserve"> </w:t>
-      </w:r>
-      <w:r>
-        <w:rPr>
-          <w:rStyle w:val="VerbatimChar"/>
-        </w:rPr>
-        <w:t xml:space="preserve">MAX_WEEK = 22</w:t>
-      </w:r>
-      <w:r>
-        <w:t xml:space="preserve">.</w:t>
+        <w:t xml:space="preserve">Weekly accuracy ranged from 16.7% to 100% (see the dashboard below for the full trajectory). Weeks 16, 17, and 19 were unusually poor (25–31%), all in the enhanced-model period and coinciding with late-season weeks where playoff-seeding implications alter team behavior (rested starters, lineup changes) in ways the season-to-date statistical features don’t capture.</w:t>
       </w:r>
     </w:p>
     <w:p>
@@ -2931,20 +1480,20 @@
       <w:r>
         <w:drawing>
           <wp:inline>
-            <wp:extent cx="5334000" cy="3988758"/>
+            <wp:extent cx="5067300" cy="3789320"/>
             <wp:effectExtent b="0" l="0" r="0" t="0"/>
-            <wp:docPr descr="Season-long performance dashboard (Plot.ipynb). Top-left: weekly accuracy against the 50% baseline. Top-right: cumulative accuracy converging to 54.4% by Week 22. Bottom-left: correct vs. incorrect predictions per week. Bottom-right: accuracy restricted to picks with stated confidence &gt;65%." title="" id="27" name="Picture"/>
+            <wp:docPr descr="Season-long performance dashboard (Plot.ipynb). Top-left: weekly accuracy vs. the 50% baseline. Top-right: cumulative accuracy converging to 54.4%. Bottom-left: correct/incorrect predictions per week. Bottom-right: accuracy on picks with stated confidence &gt;65%." title="" id="26" name="Picture"/>
             <a:graphic>
               <a:graphicData uri="http://schemas.openxmlformats.org/drawingml/2006/picture">
                 <pic:pic>
                   <pic:nvPicPr>
-                    <pic:cNvPr descr="figures/season_performance_dashboard.png" id="28" name="Picture"/>
+                    <pic:cNvPr descr="figures/season_performance_dashboard.png" id="27" name="Picture"/>
                     <pic:cNvPicPr>
                       <a:picLocks noChangeArrowheads="1" noChangeAspect="1"/>
                     </pic:cNvPicPr>
                   </pic:nvPicPr>
                   <pic:blipFill>
-                    <a:blip r:embed="rId26"/>
+                    <a:blip r:embed="rId25"/>
                     <a:stretch>
                       <a:fillRect/>
                     </a:stretch>
@@ -2952,7 +1501,7 @@
                   <pic:spPr bwMode="auto">
                     <a:xfrm>
                       <a:off x="0" y="0"/>
-                      <a:ext cx="5334000" cy="3988758"/>
+                      <a:ext cx="5067300" cy="3789320"/>
                     </a:xfrm>
                     <a:prstGeom prst="rect">
                       <a:avLst/>
@@ -2985,15 +1534,25 @@
         <w:t xml:space="preserve">Plot.ipynb</w:t>
       </w:r>
       <w:r>
-        <w:t xml:space="preserve">). Top-left: weekly accuracy against the 50% baseline. Top-right: cumulative accuracy converging to 54.4% by Week 22. Bottom-left: correct vs. incorrect predictions per week. Bottom-right: accuracy restricted to picks with stated confidence &gt;65%.</w:t>
-      </w:r>
-    </w:p>
-    <w:p>
-      <w:pPr>
-        <w:pStyle w:val="BodyText"/>
-      </w:pPr>
-      <w:r>
-        <w:t xml:space="preserve">To evaluate classifier behavior beyond a single accuracy number, all 283 graded 2025-season predictions were also aggregated into a confusion matrix (home-win vs. away-win framing):</w:t>
+        <w:t xml:space="preserve">). Top-left: weekly accuracy vs. the 50% baseline. Top-right: cumulative accuracy converging to 54.4%. Bottom-left: correct/incorrect predictions per week. Bottom-right: accuracy on picks with stated confidence &gt;65%.</w:t>
+      </w:r>
+    </w:p>
+    <w:bookmarkEnd w:id="28"/>
+    <w:bookmarkStart w:id="35" w:name="calibration-and-discrimination"/>
+    <w:p>
+      <w:pPr>
+        <w:pStyle w:val="Heading3"/>
+      </w:pPr>
+      <w:r>
+        <w:t xml:space="preserve">4.4 Calibration and Discrimination</w:t>
+      </w:r>
+    </w:p>
+    <w:p>
+      <w:pPr>
+        <w:pStyle w:val="FirstParagraph"/>
+      </w:pPr>
+      <w:r>
+        <w:t xml:space="preserve">Section 2.1 motivated calibrating every classifier because Wunderlich et al. found calibration-optimized models substantially outperform accuracy-optimized ones in realized return. Binning the 283 graded predictions by stated confidence checks whether that goal was met in practice:</w:t>
       </w:r>
     </w:p>
     <w:p>
@@ -3003,14 +1562,14 @@
       <w:r>
         <w:drawing>
           <wp:inline>
-            <wp:extent cx="5029200" cy="4389120"/>
+            <wp:extent cx="4000500" cy="2857500"/>
             <wp:effectExtent b="0" l="0" r="0" t="0"/>
-            <wp:docPr descr="Confusion matrix, all 283 graded games. The model is biased toward predicting home wins (206 home-win predictions vs. 77 away-win predictions) relative to the actual split (151 home wins vs. 132 away wins), consistent with the fixed +2.5-point home-field-advantage feature described in Section 3.2." title="" id="30" name="Picture"/>
+            <wp:docPr descr="Stated confidence vs. actual accuracy. A well-calibrated model shows accuracy rising monotonically; instead it is non-monotonic — the highest-confidence bucket (&gt;0.70, n=37) is the second-worst performer at 51.4%, below the 0.55–0.60 bucket’s 67.6%." title="" id="30" name="Picture"/>
             <a:graphic>
               <a:graphicData uri="http://schemas.openxmlformats.org/drawingml/2006/picture">
                 <pic:pic>
                   <pic:nvPicPr>
-                    <pic:cNvPr descr="figures/confusion_matrix.png" id="31" name="Picture"/>
+                    <pic:cNvPr descr="figures/calibration_chart.png" id="31" name="Picture"/>
                     <pic:cNvPicPr>
                       <a:picLocks noChangeArrowheads="1" noChangeAspect="1"/>
                     </pic:cNvPicPr>
@@ -3024,7 +1583,7 @@
                   <pic:spPr bwMode="auto">
                     <a:xfrm>
                       <a:off x="0" y="0"/>
-                      <a:ext cx="5029200" cy="4389120"/>
+                      <a:ext cx="4000500" cy="2857500"/>
                     </a:xfrm>
                     <a:prstGeom prst="rect">
                       <a:avLst/>
@@ -3048,40 +1607,27 @@
         <w:pStyle w:val="ImageCaption"/>
       </w:pPr>
       <w:r>
-        <w:t xml:space="preserve">Confusion matrix, all 283 graded games. The model is biased toward predicting home wins (206 home-win predictions vs. 77 away-win predictions) relative to the actual split (151 home wins vs. 132 away wins), consistent with the fixed +2.5-point home-field-advantage feature described in Section 3.2.</w:t>
-      </w:r>
-    </w:p>
-    <w:bookmarkEnd w:id="32"/>
-    <w:bookmarkStart w:id="39" w:name="calibration-analysis"/>
-    <w:p>
-      <w:pPr>
-        <w:pStyle w:val="Heading3"/>
-      </w:pPr>
-      <w:r>
-        <w:t xml:space="preserve">4.5 Calibration Analysis</w:t>
-      </w:r>
-    </w:p>
-    <w:p>
-      <w:pPr>
-        <w:pStyle w:val="FirstParagraph"/>
-      </w:pPr>
-      <w:r>
-        <w:t xml:space="preserve">Section 2.1 motivated wrapping every base classifier in</w:t>
-      </w:r>
-      <w:r>
-        <w:t xml:space="preserve"> </w:t>
-      </w:r>
-      <w:r>
-        <w:rPr>
-          <w:rStyle w:val="VerbatimChar"/>
-        </w:rPr>
-        <w:t xml:space="preserve">CalibratedClassifierCV</w:t>
-      </w:r>
-      <w:r>
-        <w:t xml:space="preserve"> </w:t>
-      </w:r>
-      <w:r>
-        <w:t xml:space="preserve">specifically because Wunderlich et al. (2023) found that calibration-optimized models substantially outperform accuracy-optimized ones in realized betting return. The 283 graded 2025-season predictions were binned by stated confidence to check whether that goal was met in practice:</w:t>
+        <w:t xml:space="preserve">Stated confidence vs. actual accuracy. A well-calibrated model shows accuracy rising monotonically; instead it is non-monotonic — the highest-confidence bucket (&gt;0.70, n=37) is the second-worst performer at 51.4%, below the 0.55–0.60 bucket’s 67.6%.</w:t>
+      </w:r>
+    </w:p>
+    <w:p>
+      <w:pPr>
+        <w:pStyle w:val="BodyText"/>
+      </w:pPr>
+      <w:r>
+        <w:t xml:space="preserve">Confidence does not reliably track reliability in live use. Checking discrimination directly (</w:t>
+      </w:r>
+      <w:r>
+        <w:rPr>
+          <w:rStyle w:val="VerbatimChar"/>
+        </w:rPr>
+        <w:t xml:space="preserve">home_win_prob</w:t>
+      </w:r>
+      <w:r>
+        <w:t xml:space="preserve"> </w:t>
+      </w:r>
+      <w:r>
+        <w:t xml:space="preserve">vs. actual outcome) shows the same pattern:</w:t>
       </w:r>
     </w:p>
     <w:p>
@@ -3091,20 +1637,20 @@
       <w:r>
         <w:drawing>
           <wp:inline>
-            <wp:extent cx="5334000" cy="3810000"/>
+            <wp:extent cx="3467100" cy="3178175"/>
             <wp:effectExtent b="0" l="0" r="0" t="0"/>
-            <wp:docPr descr="Stated confidence vs. actual accuracy, 2025 season. A well-calibrated model would show accuracy increasing monotonically across buckets; instead the relationship is non-monotonic — the highest-confidence bucket (&gt;0.70, n=37) is the second-worst performer at 51.4%, only marginally above the 50% baseline and well below the 0.55–0.60 bucket’s 67.6%." title="" id="34" name="Picture"/>
+            <wp:docPr descr="ROC curve, home-win probability vs. actual outcome, all 283 games. AUC = 0.528 — barely above random, and far below the 0.682 AUC from an in-sample 2020–2023-train/2024-test backtest." title="" id="33" name="Picture"/>
             <a:graphic>
               <a:graphicData uri="http://schemas.openxmlformats.org/drawingml/2006/picture">
                 <pic:pic>
                   <pic:nvPicPr>
-                    <pic:cNvPr descr="figures/calibration_chart.png" id="35" name="Picture"/>
+                    <pic:cNvPr descr="figures/roc_curve.png" id="34" name="Picture"/>
                     <pic:cNvPicPr>
                       <a:picLocks noChangeArrowheads="1" noChangeAspect="1"/>
                     </pic:cNvPicPr>
                   </pic:nvPicPr>
                   <pic:blipFill>
-                    <a:blip r:embed="rId33"/>
+                    <a:blip r:embed="rId32"/>
                     <a:stretch>
                       <a:fillRect/>
                     </a:stretch>
@@ -3112,7 +1658,7 @@
                   <pic:spPr bwMode="auto">
                     <a:xfrm>
                       <a:off x="0" y="0"/>
-                      <a:ext cx="5334000" cy="3810000"/>
+                      <a:ext cx="3467100" cy="3178175"/>
                     </a:xfrm>
                     <a:prstGeom prst="rect">
                       <a:avLst/>
@@ -3136,7 +1682,7 @@
         <w:pStyle w:val="ImageCaption"/>
       </w:pPr>
       <w:r>
-        <w:t xml:space="preserve">Stated confidence vs. actual accuracy, 2025 season. A well-calibrated model would show accuracy increasing monotonically across buckets; instead the relationship is non-monotonic — the highest-confidence bucket (&gt;0.70, n=37) is the second-worst performer at 51.4%, only marginally above the 50% baseline and well below the 0.55–0.60 bucket’s 67.6%.</w:t>
+        <w:t xml:space="preserve">ROC curve, home-win probability vs. actual outcome, all 283 games. AUC = 0.528 — barely above random, and far below the 0.682 AUC from an in-sample 2020–2023-train/2024-test backtest.</w:t>
       </w:r>
     </w:p>
     <w:p>
@@ -3144,103 +1690,17 @@
         <w:pStyle w:val="BodyText"/>
       </w:pPr>
       <w:r>
-        <w:t xml:space="preserve">This is a negative result for the calibration goal stated in Sections 1.2 and 2.1: despite isotonic calibration being applied to every base classifier, the ensemble’s stated confidence does not reliably track its actual reliability in live 2025-season use. Section 5 returns to this finding alongside the legacy-vs-enhanced accuracy comparison.</w:t>
-      </w:r>
-    </w:p>
-    <w:p>
-      <w:pPr>
-        <w:pStyle w:val="BodyText"/>
-      </w:pPr>
-      <w:r>
-        <w:t xml:space="preserve">Discrimination ability was checked the same way, using each game’s actual saved</w:t>
-      </w:r>
-      <w:r>
-        <w:t xml:space="preserve"> </w:t>
-      </w:r>
-      <w:r>
-        <w:rPr>
-          <w:rStyle w:val="VerbatimChar"/>
-        </w:rPr>
-        <w:t xml:space="preserve">home_win_prob</w:t>
-      </w:r>
-      <w:r>
-        <w:t xml:space="preserve"> </w:t>
-      </w:r>
-      <w:r>
-        <w:t xml:space="preserve">against the actual outcome:</w:t>
-      </w:r>
-    </w:p>
-    <w:p>
-      <w:pPr>
-        <w:pStyle w:val="CaptionedFigure"/>
-      </w:pPr>
-      <w:r>
-        <w:drawing>
-          <wp:inline>
-            <wp:extent cx="5334000" cy="4889500"/>
-            <wp:effectExtent b="0" l="0" r="0" t="0"/>
-            <wp:docPr descr="ROC curve, home-win probability vs. actual outcome, all 283 graded 2025-season games. AUC = 0.528 — barely above the 0.500 line for random guessing, and far below the 0.682 AUC reported from an in-sample 2020–2023-train/2024-test backtest during development. The gap between the two illustrates the same overfitting-to-backtest risk discussed in Section 5.1." title="" id="37" name="Picture"/>
-            <a:graphic>
-              <a:graphicData uri="http://schemas.openxmlformats.org/drawingml/2006/picture">
-                <pic:pic>
-                  <pic:nvPicPr>
-                    <pic:cNvPr descr="figures/roc_curve.png" id="38" name="Picture"/>
-                    <pic:cNvPicPr>
-                      <a:picLocks noChangeArrowheads="1" noChangeAspect="1"/>
-                    </pic:cNvPicPr>
-                  </pic:nvPicPr>
-                  <pic:blipFill>
-                    <a:blip r:embed="rId36"/>
-                    <a:stretch>
-                      <a:fillRect/>
-                    </a:stretch>
-                  </pic:blipFill>
-                  <pic:spPr bwMode="auto">
-                    <a:xfrm>
-                      <a:off x="0" y="0"/>
-                      <a:ext cx="5334000" cy="4889500"/>
-                    </a:xfrm>
-                    <a:prstGeom prst="rect">
-                      <a:avLst/>
-                    </a:prstGeom>
-                    <a:noFill/>
-                    <a:ln w="9525">
-                      <a:noFill/>
-                      <a:headEnd/>
-                      <a:tailEnd/>
-                    </a:ln>
-                  </pic:spPr>
-                </pic:pic>
-              </a:graphicData>
-            </a:graphic>
-          </wp:inline>
-        </w:drawing>
-      </w:r>
-    </w:p>
-    <w:p>
-      <w:pPr>
-        <w:pStyle w:val="ImageCaption"/>
-      </w:pPr>
-      <w:r>
-        <w:t xml:space="preserve">ROC curve, home-win probability vs. actual outcome, all 283 graded 2025-season games. AUC = 0.528 — barely above the 0.500 line for random guessing, and far below the 0.682 AUC reported from an in-sample 2020–2023-train/2024-test backtest during development. The gap between the two illustrates the same overfitting-to-backtest risk discussed in Section 5.1.</w:t>
-      </w:r>
-    </w:p>
-    <w:p>
-      <w:pPr>
-        <w:pStyle w:val="BodyText"/>
-      </w:pPr>
-      <w:r>
-        <w:t xml:space="preserve">An AUC this close to 0.5 indicates the model’s probability outputs carry only weak discriminative signal once evaluated on genuinely unseen, future games, even though the same architecture scored appreciably better on a retrospective same-population holdout split. This is reported here specifically because the gap is diagnostic, not because it is flattering — a reader who only saw the backtest AUC would draw a materially wrong conclusion about the system’s real predictive power.</w:t>
-      </w:r>
-    </w:p>
-    <w:bookmarkEnd w:id="39"/>
-    <w:bookmarkStart w:id="40" w:name="example-output"/>
+        <w:t xml:space="preserve">An AUC this close to 0.5 means the model’s probabilities carry only weak signal on genuinely unseen games, even though the same architecture scored notably better on a retrospective same-population split — a diagnostic gap, not a flattering one. A reader who only saw the backtest number would draw the wrong conclusion about the system’s real predictive power.</w:t>
+      </w:r>
+    </w:p>
+    <w:bookmarkEnd w:id="35"/>
+    <w:bookmarkStart w:id="36" w:name="example-output"/>
     <w:p>
       <w:pPr>
         <w:pStyle w:val="Heading3"/>
       </w:pPr>
       <w:r>
-        <w:t xml:space="preserve">4.6 Example Output</w:t>
+        <w:t xml:space="preserve">4.5 Example Output</w:t>
       </w:r>
     </w:p>
     <w:p>
@@ -3248,95 +1708,7 @@
         <w:pStyle w:val="FirstParagraph"/>
       </w:pPr>
       <w:r>
-        <w:t xml:space="preserve">A representative single-game winner-prediction record (Week 1,</w:t>
-      </w:r>
-      <w:r>
-        <w:t xml:space="preserve"> </w:t>
-      </w:r>
-      <w:r>
-        <w:rPr>
-          <w:rStyle w:val="VerbatimChar"/>
-        </w:rPr>
-        <w:t xml:space="preserve">week1_predictions.csv</w:t>
-      </w:r>
-      <w:r>
-        <w:t xml:space="preserve">) illustrates the output schema:</w:t>
-      </w:r>
-    </w:p>
-    <w:p>
-      <w:pPr>
-        <w:pStyle w:val="SourceCode"/>
-      </w:pPr>
-      <w:r>
-        <w:rPr>
-          <w:rStyle w:val="VerbatimChar"/>
-        </w:rPr>
-        <w:t xml:space="preserve">matchup: DAL @ PHI</w:t>
-      </w:r>
-      <w:r>
-        <w:br/>
-      </w:r>
-      <w:r>
-        <w:rPr>
-          <w:rStyle w:val="VerbatimChar"/>
-        </w:rPr>
-        <w:t xml:space="preserve">predicted_winner: PHI</w:t>
-      </w:r>
-      <w:r>
-        <w:br/>
-      </w:r>
-      <w:r>
-        <w:rPr>
-          <w:rStyle w:val="VerbatimChar"/>
-        </w:rPr>
-        <w:t xml:space="preserve">confidence: 93.5%</w:t>
-      </w:r>
-      <w:r>
-        <w:br/>
-      </w:r>
-      <w:r>
-        <w:rPr>
-          <w:rStyle w:val="VerbatimChar"/>
-        </w:rPr>
-        <w:t xml:space="preserve">home_win_prob: 93.5%</w:t>
-      </w:r>
-      <w:r>
-        <w:br/>
-      </w:r>
-      <w:r>
-        <w:rPr>
-          <w:rStyle w:val="VerbatimChar"/>
-        </w:rPr>
-        <w:t xml:space="preserve">away_win_prob: 6.5%</w:t>
-      </w:r>
-      <w:r>
-        <w:br/>
-      </w:r>
-      <w:r>
-        <w:rPr>
-          <w:rStyle w:val="VerbatimChar"/>
-        </w:rPr>
-        <w:t xml:space="preserve">actual_winner: PHI  ✓ correct</w:t>
-      </w:r>
-    </w:p>
-    <w:p>
-      <w:pPr>
-        <w:pStyle w:val="FirstParagraph"/>
-      </w:pPr>
-      <w:r>
-        <w:t xml:space="preserve">A spread-prediction record (Week 6,</w:t>
-      </w:r>
-      <w:r>
-        <w:t xml:space="preserve"> </w:t>
-      </w:r>
-      <w:r>
-        <w:rPr>
-          <w:rStyle w:val="VerbatimChar"/>
-        </w:rPr>
-        <w:t xml:space="preserve">week6_predictions.csv</w:t>
-      </w:r>
-      <w:r>
-        <w:t xml:space="preserve">) illustrates the same for the regression side — chosen deliberately as a</w:t>
+        <w:t xml:space="preserve">A winner-prediction record (Week 1) and a spread-prediction record (Week 6, deliberately a</w:t>
       </w:r>
       <w:r>
         <w:t xml:space="preserve"> </w:t>
@@ -3352,7 +1724,7 @@
         <w:t xml:space="preserve"> </w:t>
       </w:r>
       <w:r>
-        <w:t xml:space="preserve">rather than a hit, since Section 4.1’s headline numbers already show the model getting it right slightly more often than not, and a single cherry-picked correct example would understate the spread model’s actual MAE of 11.85 points (Section 5.2):</w:t>
+        <w:t xml:space="preserve">rather than a cherry-picked hit, given the model’s true 11.85-point spread MAE):</w:t>
       </w:r>
     </w:p>
     <w:p>
@@ -3363,7 +1735,7 @@
         <w:rPr>
           <w:rStyle w:val="VerbatimChar"/>
         </w:rPr>
-        <w:t xml:space="preserve">matchup: PHI @ NYG</w:t>
+        <w:t xml:space="preserve">Week 1: DAL @ PHI  | predicted PHI (93.5% conf.) | actual PHI          ✓</w:t>
       </w:r>
       <w:r>
         <w:br/>
@@ -3372,34 +1744,7 @@
         <w:rPr>
           <w:rStyle w:val="VerbatimChar"/>
         </w:rPr>
-        <w:t xml:space="preserve">predicted_spread: PHI -3.1  (home team NYG favored by only 3.1 by the model)</w:t>
-      </w:r>
-      <w:r>
-        <w:br/>
-      </w:r>
-      <w:r>
-        <w:rPr>
-          <w:rStyle w:val="VerbatimChar"/>
-        </w:rPr>
-        <w:t xml:space="preserve">predicted_winner: PHI</w:t>
-      </w:r>
-      <w:r>
-        <w:br/>
-      </w:r>
-      <w:r>
-        <w:rPr>
-          <w:rStyle w:val="VerbatimChar"/>
-        </w:rPr>
-        <w:t xml:space="preserve">actual_score: NYG 34, PHI 17</w:t>
-      </w:r>
-      <w:r>
-        <w:br/>
-      </w:r>
-      <w:r>
-        <w:rPr>
-          <w:rStyle w:val="VerbatimChar"/>
-        </w:rPr>
-        <w:t xml:space="preserve">actual_winner: NYG  ✗ wrong winner, ✗ spread off by 20.1 points</w:t>
+        <w:t xml:space="preserve">Week 6: PHI @ NYG   | predicted PHI -3.1          | actual NYG 34–17   ✗ (off by 20.1 pts)</w:t>
       </w:r>
     </w:p>
     <w:p>
@@ -3409,9 +1754,9 @@
         </w:pict>
       </w:r>
     </w:p>
-    <w:bookmarkEnd w:id="40"/>
-    <w:bookmarkEnd w:id="41"/>
-    <w:bookmarkStart w:id="45" w:name="discussion"/>
+    <w:bookmarkEnd w:id="36"/>
+    <w:bookmarkEnd w:id="37"/>
+    <w:bookmarkStart w:id="41" w:name="discussion"/>
     <w:p>
       <w:pPr>
         <w:pStyle w:val="Heading2"/>
@@ -3420,7 +1765,7 @@
         <w:t xml:space="preserve">5. Discussion</w:t>
       </w:r>
     </w:p>
-    <w:bookmarkStart w:id="42" w:name="interpretation-of-results"/>
+    <w:bookmarkStart w:id="38" w:name="interpretation-of-results"/>
     <w:p>
       <w:pPr>
         <w:pStyle w:val="Heading3"/>
@@ -3434,7 +1779,7 @@
         <w:pStyle w:val="FirstParagraph"/>
       </w:pPr>
       <w:r>
-        <w:t xml:space="preserve">The headline number — 54.4% overall accuracy — is a modest improvement over a random 50% baseline but falls well short of both the legacy model’s own 2025 performance (60.4%) and this project’s originally documented target for the enhanced model (66–68%, per the model’s own design documentation). Taken at face value, this is a negative result for the specific set of enhancements made at Week 10: a fourth ensemble member, deeper trees, temporal weighting favoring recent seasons, and additional engineered features (momentum, estimated injury impact, rest days, division rivalry) did not translate into better prospective accuracy, and in fact coincided with a roughly 11-point drop.</w:t>
+        <w:t xml:space="preserve">The headline 54.4% accuracy is a modest improvement over baseline but falls well short of both the legacy model’s own 60.4% and the enhanced model’s documented 66–68% target — a negative result for the Week-10 changes (a fourth ensemble member, deeper trees, temporal weighting, and new features), which coincided with an 11-point drop.</w:t>
       </w:r>
     </w:p>
     <w:p>
@@ -3442,7 +1787,7 @@
         <w:pStyle w:val="BodyText"/>
       </w:pPr>
       <w:r>
-        <w:t xml:space="preserve">One specific, concrete root cause was identified and fixed after the season concluded, without altering any of the historical predictions reported above (see</w:t>
+        <w:t xml:space="preserve">One concrete root cause was found and fixed after the season concluded, without altering the historical predictions above (see</w:t>
       </w:r>
       <w:r>
         <w:t xml:space="preserve"> </w:t>
@@ -3454,10 +1799,7 @@
         <w:t xml:space="preserve">nfl_predictor.py</w:t>
       </w:r>
       <w:r>
-        <w:t xml:space="preserve"> </w:t>
-      </w:r>
-      <w:r>
-        <w:t xml:space="preserve">and</w:t>
+        <w:t xml:space="preserve">,</w:t>
       </w:r>
       <w:r>
         <w:t xml:space="preserve"> </w:t>
@@ -3469,16 +1811,7 @@
         <w:t xml:space="preserve">CLAUDE.md</w:t>
       </w:r>
       <w:r>
-        <w:t xml:space="preserve"> </w:t>
-      </w:r>
-      <w:r>
-        <w:t xml:space="preserve">“Known Issues”</w:t>
-      </w:r>
-      <w:r>
-        <w:t xml:space="preserve"> </w:t>
-      </w:r>
-      <w:r>
-        <w:t xml:space="preserve">for the full account).</w:t>
+        <w:t xml:space="preserve">).</w:t>
       </w:r>
       <w:r>
         <w:t xml:space="preserve"> </w:t>
@@ -3493,7 +1826,7 @@
         <w:t xml:space="preserve"> </w:t>
       </w:r>
       <w:r>
-        <w:t xml:space="preserve">computed the</w:t>
+        <w:t xml:space="preserve">computed</w:t>
       </w:r>
       <w:r>
         <w:t xml:space="preserve"> </w:t>
@@ -3508,7 +1841,7 @@
         <w:t xml:space="preserve"> </w:t>
       </w:r>
       <w:r>
-        <w:t xml:space="preserve">feature as</w:t>
+        <w:t xml:space="preserve">as</w:t>
       </w:r>
       <w:r>
         <w:t xml:space="preserve"> </w:t>
@@ -3538,53 +1871,22 @@
         <w:t xml:space="preserve"> </w:t>
       </w:r>
       <w:r>
-        <w:t xml:space="preserve">is the</w:t>
-      </w:r>
-      <w:r>
-        <w:t xml:space="preserve"> </w:t>
-      </w:r>
-      <w:r>
-        <w:rPr>
-          <w:i/>
-          <w:iCs/>
-        </w:rPr>
-        <w:t xml:space="preserve">regular-season</w:t>
-      </w:r>
-      <w:r>
-        <w:t xml:space="preserve"> </w:t>
-      </w:r>
-      <w:r>
-        <w:t xml:space="preserve">code, so every regular-season game was labeled a playoff game and every real playoff game was labeled regular. Separately,</w:t>
-      </w:r>
-      <w:r>
-        <w:t xml:space="preserve"> </w:t>
-      </w:r>
-      <w:r>
-        <w:rPr>
-          <w:rStyle w:val="VerbatimChar"/>
-        </w:rPr>
-        <w:t xml:space="preserve">is_neutral</w:t>
-      </w:r>
-      <w:r>
-        <w:t xml:space="preserve"> </w:t>
-      </w:r>
-      <w:r>
-        <w:t xml:space="preserve">was hardcoded</w:t>
-      </w:r>
-      <w:r>
-        <w:t xml:space="preserve"> </w:t>
-      </w:r>
-      <w:r>
-        <w:rPr>
-          <w:rStyle w:val="VerbatimChar"/>
-        </w:rPr>
-        <w:t xml:space="preserve">False</w:t>
-      </w:r>
-      <w:r>
-        <w:t xml:space="preserve"> </w:t>
-      </w:r>
-      <w:r>
-        <w:t xml:space="preserve">everywhere, including the Super Bowl. Fixing both and re-running the exact same architecture on the same 2020–2023-train/2024-test retrospective split that originally motivated the 66–68% design target dropped that backtest’s own accuracy from 63.2% to 55.4% and its AUC from 0.682 to 0.552 — much closer to, though still slightly above, the honest 54.4% / 0.528 prospective numbers reported above. That is direct evidence that at least part of the gap between the model’s backtested promise and its live performance was a genuine implementation bug, not just overfitting or bad luck — though it plainly does not close the whole gap by itself, since 55.4% is still short of the original 66–68% target.</w:t>
+        <w:t xml:space="preserve">is the regular-season code — and hardcoded</w:t>
+      </w:r>
+      <w:r>
+        <w:t xml:space="preserve"> </w:t>
+      </w:r>
+      <w:r>
+        <w:rPr>
+          <w:rStyle w:val="VerbatimChar"/>
+        </w:rPr>
+        <w:t xml:space="preserve">is_neutral=False</w:t>
+      </w:r>
+      <w:r>
+        <w:t xml:space="preserve"> </w:t>
+      </w:r>
+      <w:r>
+        <w:t xml:space="preserve">everywhere, including the Super Bowl. Fixing both and re-running the same 2020–2023-train/2024-test backtest dropped its accuracy from 63.2% to 55.4% and its AUC from 0.682 to 0.552 — much closer to the honest 54.4%/0.528 prospective numbers above. That is evidence the backtest-vs-live gap was partly a real implementation bug, not just overfitting, though 55.4% still falls short of the original 66–68% target.</w:t>
       </w:r>
     </w:p>
     <w:p>
@@ -3592,7 +1894,73 @@
         <w:pStyle w:val="BodyText"/>
       </w:pPr>
       <w:r>
-        <w:t xml:space="preserve">Beyond that confirmed defect, several additional explanations remain plausible for the residual gap, none of which can be fully disentangled with the data collected here:</w:t>
+        <w:t xml:space="preserve">Other plausible, unconfirmed contributors:</w:t>
+      </w:r>
+      <w:r>
+        <w:t xml:space="preserve"> </w:t>
+      </w:r>
+      <w:r>
+        <w:rPr>
+          <w:b/>
+          <w:bCs/>
+        </w:rPr>
+        <w:t xml:space="preserve">added complexity without more training data</w:t>
+      </w:r>
+      <w:r>
+        <w:t xml:space="preserve"> </w:t>
+      </w:r>
+      <w:r>
+        <w:t xml:space="preserve">(deeper trees and a fourth ensemble member raise overfitting risk on an unchanged dataset size);</w:t>
+      </w:r>
+      <w:r>
+        <w:t xml:space="preserve"> </w:t>
+      </w:r>
+      <w:r>
+        <w:rPr>
+          <w:b/>
+          <w:bCs/>
+        </w:rPr>
+        <w:t xml:space="preserve">noisy new features</w:t>
+      </w:r>
+      <w:r>
+        <w:t xml:space="preserve"> </w:t>
+      </w:r>
+      <w:r>
+        <w:t xml:space="preserve">(injury impact is estimated from performance variance, not real reports; 3-game momentum is a high-variance statistic); and</w:t>
+      </w:r>
+      <w:r>
+        <w:t xml:space="preserve"> </w:t>
+      </w:r>
+      <w:r>
+        <w:rPr>
+          <w:b/>
+          <w:bCs/>
+        </w:rPr>
+        <w:t xml:space="preserve">late-season variance</w:t>
+      </w:r>
+      <w:r>
+        <w:t xml:space="preserve"> </w:t>
+      </w:r>
+      <w:r>
+        <w:t xml:space="preserve">(three of the four worst weeks fall in weeks with unusual incentive structures the feature set doesn’t model). At 134 vs. 149 games, some of the 11-point gap could also be sampling noise, though a gap this size isn’t fully explained by chance alone.</w:t>
+      </w:r>
+    </w:p>
+    <w:p>
+      <w:pPr>
+        <w:pStyle w:val="BodyText"/>
+      </w:pPr>
+      <w:r>
+        <w:t xml:space="preserve">This is consistent with Wunderlich et al. (Section 2.1): more sophisticated models optimized on offline metrics do not automatically translate into better live performance.</w:t>
+      </w:r>
+    </w:p>
+    <w:bookmarkEnd w:id="38"/>
+    <w:bookmarkStart w:id="39" w:name="limitations"/>
+    <w:p>
+      <w:pPr>
+        <w:pStyle w:val="Heading3"/>
+      </w:pPr>
+      <w:r>
+        <w:t xml:space="preserve">5.2 Limitations</w:t>
       </w:r>
     </w:p>
     <w:p>
@@ -3608,29 +1976,10 @@
           <w:b/>
           <w:bCs/>
         </w:rPr>
-        <w:t xml:space="preserve">Increased model complexity without proportionally more training data</w:t>
-      </w:r>
-      <w:r>
-        <w:t xml:space="preserve"> </w:t>
-      </w:r>
-      <w:r>
-        <w:t xml:space="preserve">— deeper trees (max depth 15 vs. 5) and an additional ensemble member increase the effective capacity of the model, which raises overfitting risk especially with the same underlying NFL dataset size. Cross-validated</w:t>
-      </w:r>
-      <w:r>
-        <w:t xml:space="preserve"> </w:t>
-      </w:r>
-      <w:r>
-        <w:rPr>
-          <w:i/>
-          <w:iCs/>
-        </w:rPr>
-        <w:t xml:space="preserve">training-time</w:t>
-      </w:r>
-      <w:r>
-        <w:t xml:space="preserve"> </w:t>
-      </w:r>
-      <w:r>
-        <w:t xml:space="preserve">metrics for the enhanced model may have looked strong while genuinely out-of-sample live performance suffered — a classic symptom of overfitting to historical cross-validation folds that don’t fully represent a new season’s dynamics.</w:t>
+        <w:t xml:space="preserve">Injury data is estimated</w:t>
+      </w:r>
+      <w:r>
+        <w:t xml:space="preserve">, not observed — a likely source of enhanced-model feature noise.</w:t>
       </w:r>
     </w:p>
     <w:p>
@@ -3646,57 +1995,13 @@
           <w:b/>
           <w:bCs/>
         </w:rPr>
-        <w:t xml:space="preserve">The</w:t>
-      </w:r>
-      <w:r>
-        <w:rPr>
-          <w:b/>
-          <w:bCs/>
-        </w:rPr>
-        <w:t xml:space="preserve"> </w:t>
-      </w:r>
-      <w:r>
-        <w:rPr>
-          <w:b/>
-          <w:bCs/>
-        </w:rPr>
-        <w:t xml:space="preserve">“enhanced”</w:t>
-      </w:r>
-      <w:r>
-        <w:rPr>
-          <w:b/>
-          <w:bCs/>
-        </w:rPr>
-        <w:t xml:space="preserve"> </w:t>
-      </w:r>
-      <w:r>
-        <w:rPr>
-          <w:b/>
-          <w:bCs/>
-        </w:rPr>
-        <w:t xml:space="preserve">features themselves may be weak or noisy signals</w:t>
-      </w:r>
-      <w:r>
-        <w:t xml:space="preserve"> </w:t>
-      </w:r>
-      <w:r>
-        <w:t xml:space="preserve">— the injury metric is explicitly</w:t>
-      </w:r>
-      <w:r>
-        <w:t xml:space="preserve"> </w:t>
-      </w:r>
-      <w:r>
-        <w:rPr>
-          <w:i/>
-          <w:iCs/>
-        </w:rPr>
-        <w:t xml:space="preserve">estimated</w:t>
-      </w:r>
-      <w:r>
-        <w:t xml:space="preserve"> </w:t>
-      </w:r>
-      <w:r>
-        <w:t xml:space="preserve">from performance variance rather than drawn from actual injury reports, and momentum (last-3-games win rate) is a high-variance statistic over a very small window. If these features added noise rather than signal, they could plausibly degrade rather than improve a model that otherwise had a working, simpler baseline.</w:t>
+        <w:t xml:space="preserve">No weather data</w:t>
+      </w:r>
+      <w:r>
+        <w:t xml:space="preserve"> </w:t>
+      </w:r>
+      <w:r>
+        <w:t xml:space="preserve">(wind, precipitation, temperature), known to affect scoring.</w:t>
       </w:r>
     </w:p>
     <w:p>
@@ -3712,13 +2017,13 @@
           <w:b/>
           <w:bCs/>
         </w:rPr>
-        <w:t xml:space="preserve">Late-season variance</w:t>
-      </w:r>
-      <w:r>
-        <w:t xml:space="preserve"> </w:t>
-      </w:r>
-      <w:r>
-        <w:t xml:space="preserve">— three of the four worst weeks of the season (16, 17, 19) fall in the enhanced-model period and correspond to weeks with unusual incentive structures (rested starters, games without playoff stakes), which no version of this feature set explicitly models.</w:t>
+        <w:t xml:space="preserve">No in-game state</w:t>
+      </w:r>
+      <w:r>
+        <w:t xml:space="preserve"> </w:t>
+      </w:r>
+      <w:r>
+        <w:t xml:space="preserve">— all features are pre-kickoff, season-to-date aggregates.</w:t>
       </w:r>
     </w:p>
     <w:p>
@@ -3734,13 +2039,45 @@
           <w:b/>
           <w:bCs/>
         </w:rPr>
-        <w:t xml:space="preserve">Small effective sample per comparison</w:t>
-      </w:r>
-      <w:r>
-        <w:t xml:space="preserve"> </w:t>
-      </w:r>
-      <w:r>
-        <w:t xml:space="preserve">— 134 vs. 149 games is not an enormous sample for detecting a true performance difference between two model configurations; some of the 11-point gap could be within the range of season-to-season or even split-to-split noise, though a gap this size is large enough that pure noise seems an incomplete explanation on its own.</w:t>
+        <w:t xml:space="preserve">Small samples</w:t>
+      </w:r>
+      <w:r>
+        <w:t xml:space="preserve"> </w:t>
+      </w:r>
+      <w:r>
+        <w:t xml:space="preserve">in Weeks 1–3 and 19–22 make those weeks’ accuracy figures noisy.</w:t>
+      </w:r>
+    </w:p>
+    <w:p>
+      <w:pPr>
+        <w:pStyle w:val="Compact"/>
+        <w:numPr>
+          <w:ilvl w:val="0"/>
+          <w:numId w:val="1004"/>
+        </w:numPr>
+      </w:pPr>
+      <w:r>
+        <w:rPr>
+          <w:b/>
+          <w:bCs/>
+        </w:rPr>
+        <w:t xml:space="preserve">Spread-model R² is low</w:t>
+      </w:r>
+      <w:r>
+        <w:t xml:space="preserve"> </w:t>
+      </w:r>
+      <w:r>
+        <w:t xml:space="preserve">(consistent with prior work); spreads should be read as directional, not precise.</w:t>
+      </w:r>
+    </w:p>
+    <w:bookmarkEnd w:id="39"/>
+    <w:bookmarkStart w:id="40" w:name="potential-improvements"/>
+    <w:p>
+      <w:pPr>
+        <w:pStyle w:val="Heading3"/>
+      </w:pPr>
+      <w:r>
+        <w:t xml:space="preserve">5.3 Potential Improvements</w:t>
       </w:r>
     </w:p>
     <w:p>
@@ -3748,17 +2085,147 @@
         <w:pStyle w:val="FirstParagraph"/>
       </w:pPr>
       <w:r>
-        <w:t xml:space="preserve">This finding is consistent with the calibration literature discussed in Section 2.1 (Wunderlich et al.): more sophisticated models optimized on offline metrics do not automatically translate into better live performance, and calibration/robustness matters as much as raw model capacity.</w:t>
+        <w:t xml:space="preserve">Motivated directly by Section 5.1: revert to or blend with the legacy ensemble rather than assuming more complexity helps; ablation-test each Week-10+ feature individually rather than adding them together; replace estimated injury data with real reports; add weather data; explicitly track Brier score, not just accuracy, across model versions. The</w:t>
+      </w:r>
+      <w:r>
+        <w:t xml:space="preserve"> </w:t>
+      </w:r>
+      <w:r>
+        <w:rPr>
+          <w:rStyle w:val="VerbatimChar"/>
+        </w:rPr>
+        <w:t xml:space="preserve">is_playoff</w:t>
+      </w:r>
+      <w:r>
+        <w:t xml:space="preserve">/</w:t>
+      </w:r>
+      <w:r>
+        <w:rPr>
+          <w:rStyle w:val="VerbatimChar"/>
+        </w:rPr>
+        <w:t xml:space="preserve">is_neutral</w:t>
+      </w:r>
+      <w:r>
+        <w:t xml:space="preserve"> </w:t>
+      </w:r>
+      <w:r>
+        <w:t xml:space="preserve">fixes are already live in</w:t>
+      </w:r>
+      <w:r>
+        <w:t xml:space="preserve"> </w:t>
+      </w:r>
+      <w:r>
+        <w:rPr>
+          <w:rStyle w:val="VerbatimChar"/>
+        </w:rPr>
+        <w:t xml:space="preserve">nfl_predictor.py</w:t>
+      </w:r>
+      <w:r>
+        <w:t xml:space="preserve">, guarded by a</w:t>
+      </w:r>
+      <w:r>
+        <w:t xml:space="preserve"> </w:t>
+      </w:r>
+      <w:r>
+        <w:rPr>
+          <w:rStyle w:val="VerbatimChar"/>
+        </w:rPr>
+        <w:t xml:space="preserve">run_validation_gate()</w:t>
+      </w:r>
+      <w:r>
+        <w:t xml:space="preserve"> </w:t>
+      </w:r>
+      <w:r>
+        <w:t xml:space="preserve">check that would have caught this exact regression at Week 10 — extending that fixed pipeline to a future season, rather than resuming from the original buggy one, is the natural next step.</w:t>
+      </w:r>
+    </w:p>
+    <w:p>
+      <w:r>
+        <w:pict>
+          <v:rect style="width:0;height:1.5pt" o:hralign="center" o:hrstd="t" o:hr="t"/>
+        </w:pict>
+      </w:r>
+    </w:p>
+    <w:bookmarkEnd w:id="40"/>
+    <w:bookmarkEnd w:id="41"/>
+    <w:bookmarkStart w:id="45" w:name="conclusion"/>
+    <w:p>
+      <w:pPr>
+        <w:pStyle w:val="Heading2"/>
+      </w:pPr>
+      <w:r>
+        <w:t xml:space="preserve">6. Conclusion</w:t>
+      </w:r>
+    </w:p>
+    <w:bookmarkStart w:id="42" w:name="summary-of-achievements"/>
+    <w:p>
+      <w:pPr>
+        <w:pStyle w:val="Heading3"/>
+      </w:pPr>
+      <w:r>
+        <w:t xml:space="preserve">6.1 Summary of Achievements</w:t>
+      </w:r>
+    </w:p>
+    <w:p>
+      <w:pPr>
+        <w:pStyle w:val="FirstParagraph"/>
+      </w:pPr>
+      <w:r>
+        <w:t xml:space="preserve">This project delivered a complete, end-to-end NFL prediction pipeline: automated data collection, RFE-based feature engineering, a calibrated multi-model ensemble, a separate spread regressor, and time-series-aware validation — deployed prospectively across 22 weeks (283 graded predictions), a more demanding and honest standard than a single train/test split.</w:t>
       </w:r>
     </w:p>
     <w:bookmarkEnd w:id="42"/>
-    <w:bookmarkStart w:id="43" w:name="limitations"/>
+    <w:bookmarkStart w:id="43" w:name="lessons-learned"/>
     <w:p>
       <w:pPr>
         <w:pStyle w:val="Heading3"/>
       </w:pPr>
       <w:r>
-        <w:t xml:space="preserve">5.2 Limitations</w:t>
+        <w:t xml:space="preserve">6.2 Lessons Learned</w:t>
+      </w:r>
+    </w:p>
+    <w:p>
+      <w:pPr>
+        <w:pStyle w:val="FirstParagraph"/>
+      </w:pPr>
+      <w:r>
+        <w:t xml:space="preserve">The most valuable lesson was a null result: a mid-season upgrade meant to gain 5–7 accuracy points instead cost roughly 11, in live use. Offline validation improvements (cross-validation scores, documented design targets) do not guarantee prospective gains, and added model complexity carries real overfitting risk that must be checked against live, sequential results rather than assumed from design intent alone.</w:t>
+      </w:r>
+    </w:p>
+    <w:bookmarkEnd w:id="43"/>
+    <w:bookmarkStart w:id="44" w:name="individual-contributions"/>
+    <w:p>
+      <w:pPr>
+        <w:pStyle w:val="Heading3"/>
+      </w:pPr>
+      <w:r>
+        <w:t xml:space="preserve">6.3 Individual Contributions</w:t>
+      </w:r>
+    </w:p>
+    <w:p>
+      <w:pPr>
+        <w:pStyle w:val="FirstParagraph"/>
+      </w:pPr>
+      <w:r>
+        <w:t xml:space="preserve">This project was completed individually. Akul Aggarwal was solely responsible for all data collection, feature engineering, model development (both legacy and enhanced architectures), weekly prediction generation, results aggregation and visualization, and report writing.</w:t>
+      </w:r>
+    </w:p>
+    <w:p>
+      <w:r>
+        <w:pict>
+          <v:rect style="width:0;height:1.5pt" o:hralign="center" o:hrstd="t" o:hr="t"/>
+        </w:pict>
+      </w:r>
+    </w:p>
+    <w:bookmarkEnd w:id="44"/>
+    <w:bookmarkEnd w:id="45"/>
+    <w:bookmarkStart w:id="46" w:name="references"/>
+    <w:p>
+      <w:pPr>
+        <w:pStyle w:val="Heading2"/>
+      </w:pPr>
+      <w:r>
+        <w:t xml:space="preserve">7. References</w:t>
       </w:r>
     </w:p>
     <w:p>
@@ -3770,17 +2237,20 @@
         </w:numPr>
       </w:pPr>
       <w:r>
-        <w:rPr>
-          <w:b/>
-          <w:bCs/>
-        </w:rPr>
-        <w:t xml:space="preserve">Injury data is estimated, not observed.</w:t>
-      </w:r>
-      <w:r>
-        <w:t xml:space="preserve"> </w:t>
-      </w:r>
-      <w:r>
-        <w:t xml:space="preserve">Using performance-variance-based injury proxies rather than actual injury reports is a known simplification and a likely source of some enhanced-model feature noise (Section 5.1).</w:t>
+        <w:t xml:space="preserve">Beal, R., Norman, T. J., &amp; Ramchurn, S. D. (2020). A Critical Comparison of Machine Learning Classifiers to Predict Match Outcomes in the NFL.</w:t>
+      </w:r>
+      <w:r>
+        <w:t xml:space="preserve"> </w:t>
+      </w:r>
+      <w:r>
+        <w:rPr>
+          <w:i/>
+          <w:iCs/>
+        </w:rPr>
+        <w:t xml:space="preserve">International Journal of Computer Science in Sport</w:t>
+      </w:r>
+      <w:r>
+        <w:t xml:space="preserve">, 19(2), 36–50. https://doi.org/10.2478/ijcss-2020-0009</w:t>
       </w:r>
     </w:p>
     <w:p>
@@ -3792,17 +2262,20 @@
         </w:numPr>
       </w:pPr>
       <w:r>
-        <w:rPr>
-          <w:b/>
-          <w:bCs/>
-        </w:rPr>
-        <w:t xml:space="preserve">No weather data.</w:t>
-      </w:r>
-      <w:r>
-        <w:t xml:space="preserve"> </w:t>
-      </w:r>
-      <w:r>
-        <w:t xml:space="preserve">Wind, precipitation, and temperature — known to affect passing efficiency and total scoring — are not modeled.</w:t>
+        <w:t xml:space="preserve">Fernandes, C. J., Yakubov, R., Li, Y., Prasad, A. K., &amp; Chan, T. C. Y. (2020). Predicting plays in the National Football League.</w:t>
+      </w:r>
+      <w:r>
+        <w:t xml:space="preserve"> </w:t>
+      </w:r>
+      <w:r>
+        <w:rPr>
+          <w:i/>
+          <w:iCs/>
+        </w:rPr>
+        <w:t xml:space="preserve">Journal of Sports Analytics</w:t>
+      </w:r>
+      <w:r>
+        <w:t xml:space="preserve">, 6(1), 35–52. https://doi.org/10.3233/JSA-190348</w:t>
       </w:r>
     </w:p>
     <w:p>
@@ -3814,17 +2287,20 @@
         </w:numPr>
       </w:pPr>
       <w:r>
-        <w:rPr>
-          <w:b/>
-          <w:bCs/>
-        </w:rPr>
-        <w:t xml:space="preserve">No play-by-play or in-game state.</w:t>
-      </w:r>
-      <w:r>
-        <w:t xml:space="preserve"> </w:t>
-      </w:r>
-      <w:r>
-        <w:t xml:space="preserve">All features are season-to-date aggregates computed before kickoff; the model cannot react to first-half game state, and it treats teams as static entities across a game.</w:t>
+        <w:t xml:space="preserve">Hamadani, B. (2006).</w:t>
+      </w:r>
+      <w:r>
+        <w:t xml:space="preserve"> </w:t>
+      </w:r>
+      <w:r>
+        <w:rPr>
+          <w:i/>
+          <w:iCs/>
+        </w:rPr>
+        <w:t xml:space="preserve">Predicting the Outcome of NFL Games Using Machine Learning</w:t>
+      </w:r>
+      <w:r>
+        <w:t xml:space="preserve">. Stanford University CS229 Course Project Report. https://cs229.stanford.edu/proj2006/BabakHamadani-PredictingNFLGames.pdf</w:t>
       </w:r>
     </w:p>
     <w:p>
@@ -3836,17 +2312,7 @@
         </w:numPr>
       </w:pPr>
       <w:r>
-        <w:rPr>
-          <w:b/>
-          <w:bCs/>
-        </w:rPr>
-        <w:t xml:space="preserve">Small samples in early and late season.</w:t>
-      </w:r>
-      <w:r>
-        <w:t xml:space="preserve"> </w:t>
-      </w:r>
-      <w:r>
-        <w:t xml:space="preserve">Weeks 1–3 have limited season-to-date data for feature calculation, and Weeks 19–22 have very few games (1–6), making per-week accuracy figures for those weeks highly sensitive to a small number of individual outcomes.</w:t>
+        <w:t xml:space="preserve">A Systematic Review of Machine Learning in Sports Betting: Techniques, Challenges, and Future Directions (2024). arXiv:2410.21484.</w:t>
       </w:r>
     </w:p>
     <w:p>
@@ -3858,203 +2324,7 @@
         </w:numPr>
       </w:pPr>
       <w:r>
-        <w:rPr>
-          <w:b/>
-          <w:bCs/>
-        </w:rPr>
-        <w:t xml:space="preserve">The point-spread regression model’s R² is low</w:t>
-      </w:r>
-      <w:r>
-        <w:t xml:space="preserve"> </w:t>
-      </w:r>
-      <w:r>
-        <w:t xml:space="preserve">(consistent with prior work — NFL margin of victory is inherently high-variance), meaning spread predictions should be read as directional/rough estimates rather than precise forecasts.</w:t>
-      </w:r>
-    </w:p>
-    <w:bookmarkEnd w:id="43"/>
-    <w:bookmarkStart w:id="44" w:name="potential-improvements"/>
-    <w:p>
-      <w:pPr>
-        <w:pStyle w:val="Heading3"/>
-      </w:pPr>
-      <w:r>
-        <w:t xml:space="preserve">5.3 Potential Improvements</w:t>
-      </w:r>
-    </w:p>
-    <w:p>
-      <w:pPr>
-        <w:pStyle w:val="FirstParagraph"/>
-      </w:pPr>
-      <w:r>
-        <w:t xml:space="preserve">Directly motivated by Section 5.1’s findings: (1) revert to or blend with the simpler legacy ensemble rather than assuming more model complexity is strictly better; (2) validate each Week-10+ feature’s marginal contribution individually (ablation testing) before including it, rather than adding several features simultaneously; (3) replace the estimated injury metric with actual injury report data if a reliable feed can be sourced; (4) incorporate real weather data; (5) apply the calibration-focused evaluation approach from Wunderlich et al. more rigorously — i.e., explicitly track and optimize Brier score improvements across model versions, not just accuracy, since the two can diverge; (6) the</w:t>
-      </w:r>
-      <w:r>
-        <w:t xml:space="preserve"> </w:t>
-      </w:r>
-      <w:r>
-        <w:rPr>
-          <w:rStyle w:val="VerbatimChar"/>
-        </w:rPr>
-        <w:t xml:space="preserve">is_playoff</w:t>
-      </w:r>
-      <w:r>
-        <w:t xml:space="preserve">/</w:t>
-      </w:r>
-      <w:r>
-        <w:rPr>
-          <w:rStyle w:val="VerbatimChar"/>
-        </w:rPr>
-        <w:t xml:space="preserve">is_neutral</w:t>
-      </w:r>
-      <w:r>
-        <w:t xml:space="preserve"> </w:t>
-      </w:r>
-      <w:r>
-        <w:t xml:space="preserve">bugs identified in Section 5.1 are now fixed in</w:t>
-      </w:r>
-      <w:r>
-        <w:t xml:space="preserve"> </w:t>
-      </w:r>
-      <w:r>
-        <w:rPr>
-          <w:rStyle w:val="VerbatimChar"/>
-        </w:rPr>
-        <w:t xml:space="preserve">nfl_predictor.py</w:t>
-      </w:r>
-      <w:r>
-        <w:t xml:space="preserve">, guarded by a</w:t>
-      </w:r>
-      <w:r>
-        <w:t xml:space="preserve"> </w:t>
-      </w:r>
-      <w:r>
-        <w:rPr>
-          <w:rStyle w:val="VerbatimChar"/>
-        </w:rPr>
-        <w:t xml:space="preserve">run_validation_gate()</w:t>
-      </w:r>
-      <w:r>
-        <w:t xml:space="preserve"> </w:t>
-      </w:r>
-      <w:r>
-        <w:t xml:space="preserve">check that would have caught this exact class of regression had it existed at Week 10 — extending this fixed pipeline to a future season, rather than resuming from the original buggy one, is the natural next step.</w:t>
-      </w:r>
-    </w:p>
-    <w:p>
-      <w:r>
-        <w:pict>
-          <v:rect style="width:0;height:1.5pt" o:hralign="center" o:hrstd="t" o:hr="t"/>
-        </w:pict>
-      </w:r>
-    </w:p>
-    <w:bookmarkEnd w:id="44"/>
-    <w:bookmarkEnd w:id="45"/>
-    <w:bookmarkStart w:id="49" w:name="conclusion"/>
-    <w:p>
-      <w:pPr>
-        <w:pStyle w:val="Heading2"/>
-      </w:pPr>
-      <w:r>
-        <w:t xml:space="preserve">6. Conclusion</w:t>
-      </w:r>
-    </w:p>
-    <w:bookmarkStart w:id="46" w:name="summary-of-achievements"/>
-    <w:p>
-      <w:pPr>
-        <w:pStyle w:val="Heading3"/>
-      </w:pPr>
-      <w:r>
-        <w:t xml:space="preserve">6.1 Summary of Achievements</w:t>
-      </w:r>
-    </w:p>
-    <w:p>
-      <w:pPr>
-        <w:pStyle w:val="FirstParagraph"/>
-      </w:pPr>
-      <w:r>
-        <w:t xml:space="preserve">This project delivered a complete, end-to-end NFL prediction pipeline: automated data collection from</w:t>
-      </w:r>
-      <w:r>
-        <w:t xml:space="preserve"> </w:t>
-      </w:r>
-      <w:r>
-        <w:rPr>
-          <w:rStyle w:val="VerbatimChar"/>
-        </w:rPr>
-        <w:t xml:space="preserve">nfl_data_py</w:t>
-      </w:r>
-      <w:r>
-        <w:t xml:space="preserve">, a 30+ feature engineering pipeline with RFE-based selection, a calibrated multi-model ensemble for winner classification, a separate regression pipeline for point spreads, and rigorous time-series-aware validation. The system was deployed prospectively across a full 22-week NFL season rather than evaluated only on a static holdout set, producing 283 genuinely out-of-sample graded predictions — a substantially more demanding and honest evaluation standard than a single train/test split.</w:t>
-      </w:r>
-    </w:p>
-    <w:bookmarkEnd w:id="46"/>
-    <w:bookmarkStart w:id="47" w:name="lessons-learned"/>
-    <w:p>
-      <w:pPr>
-        <w:pStyle w:val="Heading3"/>
-      </w:pPr>
-      <w:r>
-        <w:t xml:space="preserve">6.2 Lessons Learned</w:t>
-      </w:r>
-    </w:p>
-    <w:p>
-      <w:pPr>
-        <w:pStyle w:val="FirstParagraph"/>
-      </w:pPr>
-      <w:r>
-        <w:t xml:space="preserve">The most valuable lesson from this project was not a success but a null result: a mid-season architectural upgrade intended to improve accuracy by 5-7 percentage points instead coincided with a roughly 11-point</w:t>
-      </w:r>
-      <w:r>
-        <w:t xml:space="preserve"> </w:t>
-      </w:r>
-      <w:r>
-        <w:rPr>
-          <w:i/>
-          <w:iCs/>
-        </w:rPr>
-        <w:t xml:space="preserve">decrease</w:t>
-      </w:r>
-      <w:r>
-        <w:t xml:space="preserve"> </w:t>
-      </w:r>
-      <w:r>
-        <w:t xml:space="preserve">in live performance relative to the simpler model it replaced. This is a useful, concrete illustration of a core ML principle — that offline validation improvements (cross-validation scores, documented design targets) do not guarantee improvements in genuine prospective deployment, and that added model complexity carries real overfitting and noise-amplification risk that must be checked against live, sequential results rather than assumed from design intent alone.</w:t>
-      </w:r>
-    </w:p>
-    <w:bookmarkEnd w:id="47"/>
-    <w:bookmarkStart w:id="48" w:name="individual-contributions"/>
-    <w:p>
-      <w:pPr>
-        <w:pStyle w:val="Heading3"/>
-      </w:pPr>
-      <w:r>
-        <w:t xml:space="preserve">6.3 Individual Contributions</w:t>
-      </w:r>
-    </w:p>
-    <w:p>
-      <w:pPr>
-        <w:pStyle w:val="FirstParagraph"/>
-      </w:pPr>
-      <w:r>
-        <w:t xml:space="preserve">This project was completed individually. Akul Aggarwal was solely responsible for all data collection, feature engineering, model development (both legacy and enhanced architectures), weekly prediction generation, results aggregation and visualization, and report writing.</w:t>
-      </w:r>
-    </w:p>
-    <w:p>
-      <w:r>
-        <w:pict>
-          <v:rect style="width:0;height:1.5pt" o:hralign="center" o:hrstd="t" o:hr="t"/>
-        </w:pict>
-      </w:r>
-    </w:p>
-    <w:bookmarkEnd w:id="48"/>
-    <w:bookmarkEnd w:id="49"/>
-    <w:bookmarkStart w:id="50" w:name="references"/>
-    <w:p>
-      <w:pPr>
-        <w:pStyle w:val="Heading2"/>
-      </w:pPr>
-      <w:r>
-        <w:t xml:space="preserve">7. References</w:t>
+        <w:t xml:space="preserve">The Application of Machine Learning Techniques for Predicting Results in Team Sport: A Review (2019). arXiv:1912.11762.</w:t>
       </w:r>
     </w:p>
     <w:p>
@@ -4062,24 +2332,11 @@
         <w:pStyle w:val="Compact"/>
         <w:numPr>
           <w:ilvl w:val="0"/>
-          <w:numId w:val="1006"/>
+          <w:numId w:val="1005"/>
         </w:numPr>
       </w:pPr>
       <w:r>
-        <w:t xml:space="preserve">Beal, R., Norman, T. J., &amp; Ramchurn, S. D. (2020). A Critical Comparison of Machine Learning Classifiers to Predict Match Outcomes in the NFL.</w:t>
-      </w:r>
-      <w:r>
-        <w:t xml:space="preserve"> </w:t>
-      </w:r>
-      <w:r>
-        <w:rPr>
-          <w:i/>
-          <w:iCs/>
-        </w:rPr>
-        <w:t xml:space="preserve">International Journal of Computer Science in Sport</w:t>
-      </w:r>
-      <w:r>
-        <w:t xml:space="preserve">, 19(2), 36–50. https://doi.org/10.2478/ijcss-2020-0009</w:t>
+        <w:t xml:space="preserve">Wunderlich, F. et al. (2023). Machine learning for sports betting: should forecasting models be optimised for accuracy or calibration? University of Bath. arXiv:2303.06021.</w:t>
       </w:r>
     </w:p>
     <w:p>
@@ -4087,11 +2344,11 @@
         <w:pStyle w:val="Compact"/>
         <w:numPr>
           <w:ilvl w:val="0"/>
-          <w:numId w:val="1006"/>
+          <w:numId w:val="1005"/>
         </w:numPr>
       </w:pPr>
       <w:r>
-        <w:t xml:space="preserve">Fernandes, C. J., Yakubov, R., Li, Y., Prasad, A. K., &amp; Chan, T. C. Y. (2020). Predicting plays in the National Football League.</w:t>
+        <w:t xml:space="preserve">Spinosa, C. L. (2018). Testing the Efficiency of the NFL Point Spread Betting Market. CMC Senior Theses, Claremont McKenna College.</w:t>
       </w:r>
       <w:r>
         <w:t xml:space="preserve"> </w:t>
@@ -4101,10 +2358,7 @@
           <w:i/>
           <w:iCs/>
         </w:rPr>
-        <w:t xml:space="preserve">Journal of Sports Analytics</w:t>
-      </w:r>
-      <w:r>
-        <w:t xml:space="preserve">, 6(1), 35–52. https://doi.org/10.3233/JSA-190348</w:t>
+        <w:t xml:space="preserve">(undergraduate thesis, supporting source)</w:t>
       </w:r>
     </w:p>
     <w:p>
@@ -4112,11 +2366,11 @@
         <w:pStyle w:val="Compact"/>
         <w:numPr>
           <w:ilvl w:val="0"/>
-          <w:numId w:val="1006"/>
+          <w:numId w:val="1005"/>
         </w:numPr>
       </w:pPr>
       <w:r>
-        <w:t xml:space="preserve">Hamadani, B. (2006).</w:t>
+        <w:t xml:space="preserve">Fohey, N. M. The Efficiency of the NFL Point Spread Betting Market. University of Northern Iowa Honors Program Theses.</w:t>
       </w:r>
       <w:r>
         <w:t xml:space="preserve"> </w:t>
@@ -4126,10 +2380,7 @@
           <w:i/>
           <w:iCs/>
         </w:rPr>
-        <w:t xml:space="preserve">Predicting the Outcome of NFL Games Using Machine Learning</w:t>
-      </w:r>
-      <w:r>
-        <w:t xml:space="preserve">. Stanford University CS229 Course Project Report. https://cs229.stanford.edu/proj2006/BabakHamadani-PredictingNFLGames.pdf</w:t>
+        <w:t xml:space="preserve">(undergraduate thesis, supporting source)</w:t>
       </w:r>
     </w:p>
     <w:p>
@@ -4137,11 +2388,24 @@
         <w:pStyle w:val="Compact"/>
         <w:numPr>
           <w:ilvl w:val="0"/>
-          <w:numId w:val="1006"/>
+          <w:numId w:val="1005"/>
         </w:numPr>
       </w:pPr>
       <w:r>
-        <w:t xml:space="preserve">A Systematic Review of Machine Learning in Sports Betting: Techniques, Challenges, and Future Directions (2024). arXiv:2410.21484. https://arxiv.org/abs/2410.21484</w:t>
+        <w:t xml:space="preserve">Silver, N. (2012).</w:t>
+      </w:r>
+      <w:r>
+        <w:t xml:space="preserve"> </w:t>
+      </w:r>
+      <w:r>
+        <w:rPr>
+          <w:i/>
+          <w:iCs/>
+        </w:rPr>
+        <w:t xml:space="preserve">The Signal and the Noise: Why So Many Predictions Fail—but Some Don’t</w:t>
+      </w:r>
+      <w:r>
+        <w:t xml:space="preserve">. Penguin Press. ISBN 9781594204111.</w:t>
       </w:r>
     </w:p>
     <w:p>
@@ -4149,11 +2413,23 @@
         <w:pStyle w:val="Compact"/>
         <w:numPr>
           <w:ilvl w:val="0"/>
-          <w:numId w:val="1006"/>
+          <w:numId w:val="1005"/>
         </w:numPr>
       </w:pPr>
       <w:r>
-        <w:t xml:space="preserve">The Application of Machine Learning Techniques for Predicting Results in Team Sport: A Review (2019). arXiv:1912.11762. https://arxiv.org/abs/1912.11762</w:t>
+        <w:t xml:space="preserve">Cooper, D. et al. </w:t>
+      </w:r>
+      <w:r>
+        <w:rPr>
+          <w:rStyle w:val="VerbatimChar"/>
+        </w:rPr>
+        <w:t xml:space="preserve">nfl_data_py</w:t>
+      </w:r>
+      <w:r>
+        <w:t xml:space="preserve"> </w:t>
+      </w:r>
+      <w:r>
+        <w:t xml:space="preserve">[Software library]. https://github.com/cooperdff/nfl_data_py</w:t>
       </w:r>
     </w:p>
     <w:p>
@@ -4161,11 +2437,24 @@
         <w:pStyle w:val="Compact"/>
         <w:numPr>
           <w:ilvl w:val="0"/>
-          <w:numId w:val="1006"/>
+          <w:numId w:val="1005"/>
         </w:numPr>
       </w:pPr>
       <w:r>
-        <w:t xml:space="preserve">Wunderlich, F. et al. (2023). Machine learning for sports betting: should forecasting models be optimised for accuracy or calibration? University of Bath. arXiv:2303.06021. https://arxiv.org/abs/2303.06021</w:t>
+        <w:t xml:space="preserve">Pedregosa, F. et al. (2011). Scikit-learn: Machine Learning in Python.</w:t>
+      </w:r>
+      <w:r>
+        <w:t xml:space="preserve"> </w:t>
+      </w:r>
+      <w:r>
+        <w:rPr>
+          <w:i/>
+          <w:iCs/>
+        </w:rPr>
+        <w:t xml:space="preserve">Journal of Machine Learning Research</w:t>
+      </w:r>
+      <w:r>
+        <w:t xml:space="preserve">, 12, 2825–2830.</w:t>
       </w:r>
     </w:p>
     <w:p>
@@ -4173,35 +2462,11 @@
         <w:pStyle w:val="Compact"/>
         <w:numPr>
           <w:ilvl w:val="0"/>
-          <w:numId w:val="1006"/>
+          <w:numId w:val="1005"/>
         </w:numPr>
       </w:pPr>
       <w:r>
-        <w:t xml:space="preserve">Spinosa, C. L. (2018). Testing the Efficiency of the NFL Point Spread Betting Market. CMC Senior Theses, Claremont McKenna College. https://scholarship.claremont.edu/cmc_theses/986/</w:t>
-      </w:r>
-    </w:p>
-    <w:p>
-      <w:pPr>
-        <w:pStyle w:val="Compact"/>
-        <w:numPr>
-          <w:ilvl w:val="0"/>
-          <w:numId w:val="1006"/>
-        </w:numPr>
-      </w:pPr>
-      <w:r>
-        <w:t xml:space="preserve">Fohey, N. M. The Efficiency of the NFL Point Spread Betting Market. University of Northern Iowa Honors Program Theses. https://scholarworks.uni.edu/hpt/93/</w:t>
-      </w:r>
-    </w:p>
-    <w:p>
-      <w:pPr>
-        <w:pStyle w:val="Compact"/>
-        <w:numPr>
-          <w:ilvl w:val="0"/>
-          <w:numId w:val="1006"/>
-        </w:numPr>
-      </w:pPr>
-      <w:r>
-        <w:t xml:space="preserve">Silver, N. (2012).</w:t>
+        <w:t xml:space="preserve">Chen, T. &amp; Guestrin, C. (2016). XGBoost: A Scalable Tree Boosting System.</w:t>
       </w:r>
       <w:r>
         <w:t xml:space="preserve"> </w:t>
@@ -4211,99 +2476,14 @@
           <w:i/>
           <w:iCs/>
         </w:rPr>
-        <w:t xml:space="preserve">The Signal and the Noise: Why So Many Predictions Fail—but Some Don’t</w:t>
-      </w:r>
-      <w:r>
-        <w:t xml:space="preserve">. Penguin Press. ISBN 9781594204111.</w:t>
-      </w:r>
-    </w:p>
-    <w:p>
-      <w:pPr>
-        <w:pStyle w:val="Compact"/>
-        <w:numPr>
-          <w:ilvl w:val="0"/>
-          <w:numId w:val="1006"/>
-        </w:numPr>
-      </w:pPr>
-      <w:r>
-        <w:t xml:space="preserve">Cooper, D. et al. </w:t>
-      </w:r>
-      <w:r>
-        <w:rPr>
-          <w:rStyle w:val="VerbatimChar"/>
-        </w:rPr>
-        <w:t xml:space="preserve">nfl_data_py</w:t>
-      </w:r>
-      <w:r>
-        <w:t xml:space="preserve"> </w:t>
-      </w:r>
-      <w:r>
-        <w:t xml:space="preserve">[Software library]. https://github.com/cooperdff/nfl_data_py</w:t>
-      </w:r>
-    </w:p>
-    <w:p>
-      <w:pPr>
-        <w:pStyle w:val="Compact"/>
-        <w:numPr>
-          <w:ilvl w:val="0"/>
-          <w:numId w:val="1006"/>
-        </w:numPr>
-      </w:pPr>
-      <w:r>
-        <w:t xml:space="preserve">Pedregosa, F. et al. (2011). Scikit-learn: Machine Learning in Python.</w:t>
-      </w:r>
-      <w:r>
-        <w:t xml:space="preserve"> </w:t>
-      </w:r>
-      <w:r>
-        <w:rPr>
-          <w:i/>
-          <w:iCs/>
-        </w:rPr>
-        <w:t xml:space="preserve">Journal of Machine Learning Research</w:t>
-      </w:r>
-      <w:r>
-        <w:t xml:space="preserve">, 12, 2825–2830.</w:t>
-      </w:r>
-    </w:p>
-    <w:p>
-      <w:pPr>
-        <w:pStyle w:val="Compact"/>
-        <w:numPr>
-          <w:ilvl w:val="0"/>
-          <w:numId w:val="1006"/>
-        </w:numPr>
-      </w:pPr>
-      <w:r>
-        <w:t xml:space="preserve">Chen, T. &amp; Guestrin, C. (2016). XGBoost: A Scalable Tree Boosting System.</w:t>
-      </w:r>
-      <w:r>
-        <w:t xml:space="preserve"> </w:t>
-      </w:r>
-      <w:r>
-        <w:rPr>
-          <w:i/>
-          <w:iCs/>
-        </w:rPr>
-        <w:t xml:space="preserve">Proceedings of the 22nd ACM SIGKDD International Conference on Knowledge Discovery and Data Mining</w:t>
+        <w:t xml:space="preserve">Proc. 22nd ACM SIGKDD</w:t>
       </w:r>
       <w:r>
         <w:t xml:space="preserve">, 785–794.</w:t>
       </w:r>
     </w:p>
-    <w:p>
-      <w:pPr>
-        <w:pStyle w:val="FirstParagraph"/>
-      </w:pPr>
-      <w:r>
-        <w:rPr>
-          <w:i/>
-          <w:iCs/>
-        </w:rPr>
-        <w:t xml:space="preserve">Note: Sources 7 and 8 are undergraduate/honors theses rather than peer-reviewed journal articles; they are cited for their directly relevant empirical findings on NFL market efficiency but are weighted accordingly as supporting rather than primary literature.</w:t>
-      </w:r>
-    </w:p>
-    <w:bookmarkEnd w:id="50"/>
+    <w:bookmarkEnd w:id="46"/>
+    <w:bookmarkEnd w:id="47"/>
     <w:sectPr>
       <w:footnotePr>
         <w:numRestart w:val="eachSect"/>
@@ -4642,39 +2822,9 @@
     <w:abstractNumId w:val="991"/>
   </w:num>
   <w:num w:numId="1004">
-    <w:abstractNumId w:val="99411"/>
-    <w:lvlOverride w:ilvl="0">
-      <w:startOverride w:val="1"/>
-    </w:lvlOverride>
-    <w:lvlOverride w:ilvl="1">
-      <w:startOverride w:val="1"/>
-    </w:lvlOverride>
-    <w:lvlOverride w:ilvl="2">
-      <w:startOverride w:val="1"/>
-    </w:lvlOverride>
-    <w:lvlOverride w:ilvl="3">
-      <w:startOverride w:val="1"/>
-    </w:lvlOverride>
-    <w:lvlOverride w:ilvl="4">
-      <w:startOverride w:val="1"/>
-    </w:lvlOverride>
-    <w:lvlOverride w:ilvl="5">
-      <w:startOverride w:val="1"/>
-    </w:lvlOverride>
-    <w:lvlOverride w:ilvl="6">
-      <w:startOverride w:val="1"/>
-    </w:lvlOverride>
-    <w:lvlOverride w:ilvl="7">
-      <w:startOverride w:val="1"/>
-    </w:lvlOverride>
-    <w:lvlOverride w:ilvl="8">
-      <w:startOverride w:val="1"/>
-    </w:lvlOverride>
+    <w:abstractNumId w:val="991"/>
   </w:num>
   <w:num w:numId="1005">
-    <w:abstractNumId w:val="991"/>
-  </w:num>
-  <w:num w:numId="1006">
     <w:abstractNumId w:val="99411"/>
     <w:lvlOverride w:ilvl="0">
       <w:startOverride w:val="1"/>

</xml_diff>